<commit_message>
fixed so many bugs and updates
</commit_message>
<xml_diff>
--- a/pdf/DanielleBlumsteinCV.docx
+++ b/pdf/DanielleBlumsteinCV.docx
@@ -1,6 +1,6 @@
 
 <file path=word/document.xml><?xml version="1.0" encoding="utf-8"?>
-<w:document xmlns:wpc="http://schemas.microsoft.com/office/word/2010/wordprocessingCanvas" xmlns:cx="http://schemas.microsoft.com/office/drawing/2014/chartex" xmlns:cx1="http://schemas.microsoft.com/office/drawing/2015/9/8/chartex" xmlns:cx2="http://schemas.microsoft.com/office/drawing/2015/10/21/chartex" xmlns:cx3="http://schemas.microsoft.com/office/drawing/2016/5/9/chartex" xmlns:cx4="http://schemas.microsoft.com/office/drawing/2016/5/10/chartex" xmlns:cx5="http://schemas.microsoft.com/office/drawing/2016/5/11/chartex" xmlns:cx6="http://schemas.microsoft.com/office/drawing/2016/5/12/chartex" xmlns:cx7="http://schemas.microsoft.com/office/drawing/2016/5/13/chartex" xmlns:cx8="http://schemas.microsoft.com/office/drawing/2016/5/14/chartex" xmlns:mc="http://schemas.openxmlformats.org/markup-compatibility/2006" xmlns:aink="http://schemas.microsoft.com/office/drawing/2016/ink" xmlns:am3d="http://schemas.microsoft.com/office/drawing/2017/model3d" xmlns:o="urn:schemas-microsoft-com:office:office" xmlns:oel="http://schemas.microsoft.com/office/2019/extlst" xmlns:r="http://schemas.openxmlformats.org/officeDocument/2006/relationships" xmlns:m="http://schemas.openxmlformats.org/officeDocument/2006/math" xmlns:v="urn:schemas-microsoft-com:vml" xmlns:wp14="http://schemas.microsoft.com/office/word/2010/wordprocessingDrawing" xmlns:wp="http://schemas.openxmlformats.org/drawingml/2006/wordprocessingDrawing" xmlns:w10="urn:schemas-microsoft-com:office:word" xmlns:w="http://schemas.openxmlformats.org/wordprocessingml/2006/main" xmlns:w14="http://schemas.microsoft.com/office/word/2010/wordml" xmlns:w15="http://schemas.microsoft.com/office/word/2012/wordml" xmlns:w16cex="http://schemas.microsoft.com/office/word/2018/wordml/cex" xmlns:w16cid="http://schemas.microsoft.com/office/word/2016/wordml/cid" xmlns:w16="http://schemas.microsoft.com/office/word/2018/wordml" xmlns:w16du="http://schemas.microsoft.com/office/word/2023/wordml/word16du" xmlns:w16sdtdh="http://schemas.microsoft.com/office/word/2020/wordml/sdtdatahash" xmlns:w16sdtfl="http://schemas.microsoft.com/office/word/2024/wordml/sdtformatlock" xmlns:w16se="http://schemas.microsoft.com/office/word/2015/wordml/symex" xmlns:wpg="http://schemas.microsoft.com/office/word/2010/wordprocessingGroup" xmlns:wpi="http://schemas.microsoft.com/office/word/2010/wordprocessingInk" xmlns:wne="http://schemas.microsoft.com/office/word/2006/wordml" xmlns:wps="http://schemas.microsoft.com/office/word/2010/wordprocessingShape" mc:Ignorable="w14 w15 w16se w16cid w16 w16cex w16sdtdh w16sdtfl w16du wp14">
+<w:document xmlns:wpc="http://schemas.microsoft.com/office/word/2010/wordprocessingCanvas" xmlns:cx="http://schemas.microsoft.com/office/drawing/2014/chartex" xmlns:cx1="http://schemas.microsoft.com/office/drawing/2015/9/8/chartex" xmlns:cx2="http://schemas.microsoft.com/office/drawing/2015/10/21/chartex" xmlns:cx3="http://schemas.microsoft.com/office/drawing/2016/5/9/chartex" xmlns:cx4="http://schemas.microsoft.com/office/drawing/2016/5/10/chartex" xmlns:cx5="http://schemas.microsoft.com/office/drawing/2016/5/11/chartex" xmlns:cx6="http://schemas.microsoft.com/office/drawing/2016/5/12/chartex" xmlns:cx7="http://schemas.microsoft.com/office/drawing/2016/5/13/chartex" xmlns:cx8="http://schemas.microsoft.com/office/drawing/2016/5/14/chartex" xmlns:mc="http://schemas.openxmlformats.org/markup-compatibility/2006" xmlns:m="http://schemas.openxmlformats.org/officeDocument/2006/math" xmlns:aink="http://schemas.microsoft.com/office/drawing/2016/ink" xmlns:am3d="http://schemas.microsoft.com/office/drawing/2017/model3d" xmlns:oel="http://schemas.microsoft.com/office/2019/extlst" xmlns:r="http://schemas.openxmlformats.org/officeDocument/2006/relationships" xmlns:wp14="http://schemas.microsoft.com/office/word/2010/wordprocessingDrawing" xmlns:wp="http://schemas.openxmlformats.org/drawingml/2006/wordprocessingDrawing" xmlns:wpg="http://schemas.microsoft.com/office/word/2010/wordprocessingGroup" xmlns:wpi="http://schemas.microsoft.com/office/word/2010/wordprocessingInk" xmlns:wps="http://schemas.microsoft.com/office/word/2010/wordprocessingShape" xmlns:o="urn:schemas-microsoft-com:office:office" xmlns:v="urn:schemas-microsoft-com:vml" xmlns:w10="urn:schemas-microsoft-com:office:word" xmlns:w="http://schemas.openxmlformats.org/wordprocessingml/2006/main" xmlns:w14="http://schemas.microsoft.com/office/word/2010/wordml" xmlns:w15="http://schemas.microsoft.com/office/word/2012/wordml" xmlns:w16cex="http://schemas.microsoft.com/office/word/2018/wordml/cex" xmlns:w16cid="http://schemas.microsoft.com/office/word/2016/wordml/cid" xmlns:w16="http://schemas.microsoft.com/office/word/2018/wordml" xmlns:w16sdtdh="http://schemas.microsoft.com/office/word/2020/wordml/sdtdatahash" xmlns:w16sdtfl="http://schemas.microsoft.com/office/word/2024/wordml/sdtformatlock" xmlns:w16se="http://schemas.microsoft.com/office/word/2015/wordml/symex" xmlns:w16du="http://schemas.microsoft.com/office/word/2023/wordml/word16du" xmlns:wne="http://schemas.microsoft.com/office/word/2006/wordml" mc:Ignorable="w14 w15 w16se w16cid w16 w16cex w16sdtdh w16sdtfl w16du wp14">
   <w:body>
     <w:p>
       <w:pPr>
@@ -350,33 +350,6 @@
                               </w:rPr>
                               <w:t xml:space="preserve">Email: dani.blumstein@gmail.com </w:t>
                             </w:r>
-                          </w:p>
-                          <w:p>
-                            <w:pPr>
-                              <w:tabs>
-                                <w:tab w:val="center" w:pos="7054"/>
-                                <w:tab w:val="center" w:pos="8854"/>
-                              </w:tabs>
-                              <w:spacing w:line="259" w:lineRule="auto"/>
-                              <w:rPr>
-                                <w:color w:val="FFFFFF"/>
-                              </w:rPr>
-                            </w:pPr>
-                            <w:r>
-                              <w:rPr>
-                                <w:color w:val="FFFFFF"/>
-                              </w:rPr>
-                              <w:t xml:space="preserve">Twitter: @DaniBlumstein </w:t>
-                            </w:r>
-                          </w:p>
-                          <w:p>
-                            <w:pPr>
-                              <w:tabs>
-                                <w:tab w:val="center" w:pos="7054"/>
-                                <w:tab w:val="center" w:pos="8854"/>
-                              </w:tabs>
-                              <w:spacing w:line="259" w:lineRule="auto"/>
-                            </w:pPr>
                             <w:r>
                               <w:t xml:space="preserve">Website: </w:t>
                             </w:r>
@@ -460,33 +433,6 @@
                         </w:rPr>
                         <w:t xml:space="preserve">Email: dani.blumstein@gmail.com </w:t>
                       </w:r>
-                    </w:p>
-                    <w:p>
-                      <w:pPr>
-                        <w:tabs>
-                          <w:tab w:val="center" w:pos="7054"/>
-                          <w:tab w:val="center" w:pos="8854"/>
-                        </w:tabs>
-                        <w:spacing w:line="259" w:lineRule="auto"/>
-                        <w:rPr>
-                          <w:color w:val="FFFFFF"/>
-                        </w:rPr>
-                      </w:pPr>
-                      <w:r>
-                        <w:rPr>
-                          <w:color w:val="FFFFFF"/>
-                        </w:rPr>
-                        <w:t xml:space="preserve">Twitter: @DaniBlumstein </w:t>
-                      </w:r>
-                    </w:p>
-                    <w:p>
-                      <w:pPr>
-                        <w:tabs>
-                          <w:tab w:val="center" w:pos="7054"/>
-                          <w:tab w:val="center" w:pos="8854"/>
-                        </w:tabs>
-                        <w:spacing w:line="259" w:lineRule="auto"/>
-                      </w:pPr>
                       <w:r>
                         <w:t xml:space="preserve">Website: </w:t>
                       </w:r>
@@ -1064,36 +1010,18 @@
         <w:t>Blumstein DM</w:t>
       </w:r>
       <w:r>
-        <w:t xml:space="preserve"> and </w:t>
-      </w:r>
-      <w:proofErr w:type="spellStart"/>
-      <w:r>
-        <w:t>MacManes</w:t>
-      </w:r>
-      <w:proofErr w:type="spellEnd"/>
-      <w:r>
-        <w:t>, MD.</w:t>
-      </w:r>
-      <w:r>
-        <w:t xml:space="preserve"> 2024.</w:t>
-      </w:r>
-      <w:r>
-        <w:t xml:space="preserve"> Impacts of dietary fat on multi tissue gene expression in the desert-adapted cactus mouse. Journal of Experimental Biology. </w:t>
-      </w:r>
-      <w:r>
-        <w:rPr>
-          <w:i/>
-          <w:iCs/>
-        </w:rPr>
-        <w:t>J Exp Biol</w:t>
-      </w:r>
-      <w:r>
-        <w:t xml:space="preserve"> 227 (24): jeb247978.</w:t>
-      </w:r>
-    </w:p>
-    <w:p>
-      <w:pPr>
-        <w:ind w:left="360" w:right="90" w:hanging="360"/>
+        <w:t xml:space="preserve">, Patel A, Schiro G, Suzuki. 2026. Beyond distance-decay: The Mississippi River shapes gut microbiome communities in the Peromyscus maniculatus species complex. BioRxiv. </w:t>
+      </w:r>
+      <w:hyperlink r:id="rId8" w:history="1">
+        <w:r>
+          <w:t>https://doi.org/10.64898/2026.06.03.729934</w:t>
+        </w:r>
+      </w:hyperlink>
+    </w:p>
+    <w:p>
+      <w:pPr>
+        <w:spacing w:line="259" w:lineRule="auto"/>
+        <w:ind w:left="270" w:right="90" w:hanging="270"/>
         <w:rPr>
           <w:b/>
           <w:bCs/>
@@ -1114,6 +1042,48 @@
         <w:t>Blumstein DM</w:t>
       </w:r>
       <w:r>
+        <w:t xml:space="preserve"> and MacManes, MD.</w:t>
+      </w:r>
+      <w:r>
+        <w:t xml:space="preserve"> 2024.</w:t>
+      </w:r>
+      <w:r>
+        <w:t xml:space="preserve"> Impacts of dietary fat on multi tissue gene expression in the desert-adapted cactus mouse. Journal of Experimental Biology. </w:t>
+      </w:r>
+      <w:r>
+        <w:rPr>
+          <w:i/>
+          <w:iCs/>
+        </w:rPr>
+        <w:t>J Exp Biol</w:t>
+      </w:r>
+      <w:r>
+        <w:t xml:space="preserve"> 227 (24): jeb247978.</w:t>
+      </w:r>
+    </w:p>
+    <w:p>
+      <w:pPr>
+        <w:ind w:left="360" w:right="90" w:hanging="360"/>
+        <w:rPr>
+          <w:b/>
+          <w:bCs/>
+        </w:rPr>
+      </w:pPr>
+    </w:p>
+    <w:p>
+      <w:pPr>
+        <w:ind w:left="360" w:right="90" w:hanging="360"/>
+      </w:pPr>
+      <w:r>
+        <w:rPr>
+          <w:b/>
+          <w:bCs/>
+          <w:i/>
+          <w:iCs/>
+        </w:rPr>
+        <w:t>Blumstein DM</w:t>
+      </w:r>
+      <w:r>
         <w:t xml:space="preserve">, Colella, JP, E Linder, and </w:t>
       </w:r>
       <w:proofErr w:type="spellStart"/>
@@ -1184,15 +1154,7 @@
         <w:t>Blumstein DM</w:t>
       </w:r>
       <w:r>
-        <w:t xml:space="preserve"> and </w:t>
-      </w:r>
-      <w:proofErr w:type="spellStart"/>
-      <w:r>
-        <w:t>MacManes</w:t>
-      </w:r>
-      <w:proofErr w:type="spellEnd"/>
-      <w:r>
-        <w:t>, MD. 2024</w:t>
+        <w:t xml:space="preserve"> and MacManes, MD. 2024</w:t>
       </w:r>
       <w:r>
         <w:t>.</w:t>
@@ -1284,15 +1246,7 @@
         <w:t>Blumstein DM</w:t>
       </w:r>
       <w:r>
-        <w:t xml:space="preserve"> and </w:t>
-      </w:r>
-      <w:proofErr w:type="spellStart"/>
-      <w:r>
-        <w:t>MacManes</w:t>
-      </w:r>
-      <w:proofErr w:type="spellEnd"/>
-      <w:r>
-        <w:t xml:space="preserve">, MD. 2023. When the tap runs dry: The physiological effects of acute experimental dehydration in Peromyscus </w:t>
+        <w:t xml:space="preserve"> and MacManes, MD. 2023. When the tap runs dry: The physiological effects of acute experimental dehydration in Peromyscus </w:t>
       </w:r>
       <w:proofErr w:type="spellStart"/>
       <w:r>
@@ -1408,6 +1362,7 @@
           <w:b/>
           <w:i/>
         </w:rPr>
+        <w:lastRenderedPageBreak/>
         <w:t>Blumstein DM</w:t>
       </w:r>
       <w:r>
@@ -1457,7 +1412,6 @@
           <w:b/>
           <w:i/>
         </w:rPr>
-        <w:lastRenderedPageBreak/>
         <w:t>Blumstein DM</w:t>
       </w:r>
       <w:r>
@@ -2193,11 +2147,30 @@
           <w:bCs/>
         </w:rPr>
       </w:pPr>
-      <w:r>
+    </w:p>
+    <w:p>
+      <w:pPr>
+        <w:ind w:left="270" w:right="90" w:hanging="270"/>
         <w:rPr>
           <w:b/>
           <w:bCs/>
         </w:rPr>
+      </w:pPr>
+    </w:p>
+    <w:p>
+      <w:pPr>
+        <w:ind w:left="270" w:right="90" w:hanging="270"/>
+        <w:rPr>
+          <w:b/>
+          <w:bCs/>
+        </w:rPr>
+      </w:pPr>
+      <w:r>
+        <w:rPr>
+          <w:b/>
+          <w:bCs/>
+        </w:rPr>
+        <w:lastRenderedPageBreak/>
         <w:t>WORKSHOPS AND SPECIAL COURSES</w:t>
       </w:r>
     </w:p>
@@ -2274,7 +2247,6 @@
         <w:rPr>
           <w:rFonts w:ascii="TimesNewRomanPSMT" w:hAnsi="TimesNewRomanPSMT"/>
         </w:rPr>
-        <w:lastRenderedPageBreak/>
         <w:t>2017 RAD Sequencing Workshop. Molecular Conservation Genetics Laboratory, University of Wisconsin – Stevens Point</w:t>
       </w:r>
     </w:p>
@@ -2849,9 +2821,10 @@
         <w:ind w:left="270" w:right="90" w:hanging="270"/>
       </w:pPr>
       <w:r>
+        <w:lastRenderedPageBreak/>
         <w:t xml:space="preserve">Inside JEB Feature: </w:t>
       </w:r>
-      <w:hyperlink r:id="rId8" w:tgtFrame="_blank" w:history="1">
+      <w:hyperlink r:id="rId9" w:tgtFrame="_blank" w:history="1">
         <w:r>
           <w:t>https://doi.org/10.1242/jeb.246924</w:t>
         </w:r>
@@ -2864,7 +2837,7 @@
       <w:r>
         <w:t xml:space="preserve">JEB ECR Spotlight: </w:t>
       </w:r>
-      <w:hyperlink r:id="rId9" w:tgtFrame="_blank" w:history="1">
+      <w:hyperlink r:id="rId10" w:tgtFrame="_blank" w:history="1">
         <w:r>
           <w:t>https://doi.org/10.1242/jeb.246936</w:t>
         </w:r>
@@ -2872,429 +2845,42 @@
     </w:p>
     <w:p>
       <w:pPr>
+        <w:ind w:right="90"/>
+        <w:rPr>
+          <w:b/>
+          <w:bCs/>
+        </w:rPr>
+      </w:pPr>
+    </w:p>
+    <w:p>
+      <w:pPr>
         <w:ind w:left="270" w:right="90" w:hanging="270"/>
         <w:rPr>
           <w:b/>
           <w:bCs/>
         </w:rPr>
       </w:pPr>
-    </w:p>
-    <w:p>
-      <w:pPr>
-        <w:ind w:left="270" w:right="90" w:hanging="270"/>
+      <w:r>
         <w:rPr>
           <w:b/>
           <w:bCs/>
         </w:rPr>
-      </w:pPr>
-    </w:p>
-    <w:p>
-      <w:pPr>
-        <w:ind w:left="270" w:right="90" w:hanging="270"/>
+        <w:t xml:space="preserve">ADDITONAL </w:t>
+      </w:r>
+      <w:r>
         <w:rPr>
           <w:b/>
           <w:bCs/>
         </w:rPr>
-      </w:pPr>
-    </w:p>
-    <w:p>
-      <w:pPr>
-        <w:ind w:left="270" w:right="90" w:hanging="270"/>
+        <w:t xml:space="preserve">RESEARCH </w:t>
+      </w:r>
+      <w:r>
         <w:rPr>
           <w:b/>
           <w:bCs/>
         </w:rPr>
-      </w:pPr>
-      <w:r>
-        <w:rPr>
-          <w:b/>
-          <w:bCs/>
-        </w:rPr>
-        <w:lastRenderedPageBreak/>
-        <w:t xml:space="preserve">RESEARCH </w:t>
-      </w:r>
-      <w:r>
-        <w:rPr>
-          <w:b/>
-          <w:bCs/>
-        </w:rPr>
         <w:t>EXPERIENCE</w:t>
       </w:r>
-    </w:p>
-    <w:p>
-      <w:pPr>
-        <w:ind w:left="270" w:right="90" w:hanging="270"/>
-      </w:pPr>
-      <w:r>
-        <w:rPr>
-          <w:b/>
-          <w:bCs/>
-        </w:rPr>
-        <w:t xml:space="preserve">October </w:t>
-      </w:r>
-      <w:r>
-        <w:rPr>
-          <w:b/>
-          <w:bCs/>
-        </w:rPr>
-        <w:t xml:space="preserve">2024 – </w:t>
-      </w:r>
-      <w:r>
-        <w:rPr>
-          <w:b/>
-          <w:bCs/>
-        </w:rPr>
-        <w:t>May 2025</w:t>
-      </w:r>
-      <w:r>
-        <w:rPr>
-          <w:b/>
-          <w:bCs/>
-        </w:rPr>
-        <w:t xml:space="preserve"> </w:t>
-      </w:r>
-      <w:r>
-        <w:t>Research Associate</w:t>
-      </w:r>
-    </w:p>
-    <w:p>
-      <w:pPr>
-        <w:ind w:left="270" w:right="90" w:hanging="270"/>
-        <w:rPr>
-          <w:i/>
-          <w:iCs/>
-        </w:rPr>
-      </w:pPr>
-      <w:r>
-        <w:rPr>
-          <w:i/>
-          <w:iCs/>
-        </w:rPr>
-        <w:t xml:space="preserve">State Fisheries Genomics Lab, </w:t>
-      </w:r>
-      <w:r>
-        <w:rPr>
-          <w:rFonts w:ascii="TimesNewRomanPSMT" w:hAnsi="TimesNewRomanPSMT"/>
-          <w:i/>
-          <w:iCs/>
-        </w:rPr>
-        <w:t>Hatfield Marine Science Center</w:t>
-      </w:r>
-      <w:r>
-        <w:rPr>
-          <w:rFonts w:ascii="TimesNewRomanPSMT" w:hAnsi="TimesNewRomanPSMT"/>
-        </w:rPr>
-        <w:t xml:space="preserve">, </w:t>
-      </w:r>
-      <w:r>
-        <w:rPr>
-          <w:i/>
-          <w:iCs/>
-        </w:rPr>
-        <w:t>Oregon State University</w:t>
-      </w:r>
-    </w:p>
-    <w:p>
-      <w:pPr>
-        <w:ind w:left="270" w:right="90" w:hanging="270"/>
-      </w:pPr>
-      <w:r>
-        <w:t xml:space="preserve">Primary investigator: </w:t>
-      </w:r>
-      <w:r>
-        <w:t xml:space="preserve">Dr. </w:t>
-      </w:r>
-      <w:r>
-        <w:t xml:space="preserve">Kathleen O’Malley </w:t>
-      </w:r>
-    </w:p>
-    <w:p>
-      <w:pPr>
-        <w:ind w:left="270" w:right="90" w:hanging="270"/>
-      </w:pPr>
-      <w:r>
-        <w:t>“</w:t>
-      </w:r>
-      <w:r>
-        <w:t>G</w:t>
-      </w:r>
-      <w:r>
-        <w:t>enetic and genomic analysis of reintroduced fish to the productivity of at-risk salmon populations.</w:t>
-      </w:r>
-      <w:r>
-        <w:t>”</w:t>
-      </w:r>
-    </w:p>
-    <w:p>
-      <w:pPr>
-        <w:ind w:left="270" w:right="90" w:hanging="270"/>
-      </w:pPr>
-    </w:p>
-    <w:p>
-      <w:pPr>
-        <w:ind w:left="270" w:right="90" w:hanging="270"/>
-      </w:pPr>
-      <w:r>
-        <w:rPr>
-          <w:b/>
-          <w:bCs/>
-        </w:rPr>
-        <w:t xml:space="preserve">May 2024- September 2024 </w:t>
-      </w:r>
-      <w:r>
-        <w:t>Field Team Director</w:t>
-      </w:r>
-    </w:p>
-    <w:p>
-      <w:pPr>
-        <w:ind w:left="270" w:right="90" w:hanging="270"/>
-        <w:rPr>
-          <w:i/>
-        </w:rPr>
-      </w:pPr>
-      <w:r>
-        <w:rPr>
-          <w:i/>
-        </w:rPr>
-        <w:t>College of Natural Sciences and Mathematics, University of Denver, Colorado</w:t>
-      </w:r>
-    </w:p>
-    <w:p>
-      <w:pPr>
-        <w:spacing w:line="276" w:lineRule="auto"/>
-        <w:rPr>
-          <w:color w:val="000000" w:themeColor="text1"/>
-        </w:rPr>
-      </w:pPr>
-      <w:r>
-        <w:t>“</w:t>
-      </w:r>
-      <w:r>
-        <w:rPr>
-          <w:color w:val="000000" w:themeColor="text1"/>
-        </w:rPr>
-        <w:t>Maintenance of a small mammal trapping grid</w:t>
-      </w:r>
-      <w:r>
-        <w:rPr>
-          <w:color w:val="000000" w:themeColor="text1"/>
-        </w:rPr>
-        <w:t xml:space="preserve"> for the c</w:t>
-      </w:r>
-      <w:r>
-        <w:rPr>
-          <w:color w:val="000000" w:themeColor="text1"/>
-        </w:rPr>
-        <w:t>apture, handling, and tagging of deer mice</w:t>
-      </w:r>
-      <w:r>
-        <w:rPr>
-          <w:color w:val="000000" w:themeColor="text1"/>
-        </w:rPr>
-        <w:t xml:space="preserve"> for f</w:t>
-      </w:r>
-      <w:r>
-        <w:rPr>
-          <w:color w:val="000000" w:themeColor="text1"/>
-        </w:rPr>
-        <w:t>ield respirometry</w:t>
-      </w:r>
-      <w:r>
-        <w:rPr>
-          <w:color w:val="000000" w:themeColor="text1"/>
-        </w:rPr>
-        <w:t>”</w:t>
-      </w:r>
-    </w:p>
-    <w:p>
-      <w:pPr>
-        <w:ind w:left="270" w:right="90" w:hanging="270"/>
-        <w:rPr>
-          <w:b/>
-        </w:rPr>
-      </w:pPr>
-    </w:p>
-    <w:p>
-      <w:pPr>
-        <w:ind w:left="270" w:right="90" w:hanging="270"/>
-        <w:rPr>
-          <w:b/>
-        </w:rPr>
-      </w:pPr>
-      <w:r>
-        <w:rPr>
-          <w:b/>
-        </w:rPr>
-        <w:t xml:space="preserve">Aug </w:t>
-      </w:r>
-      <w:r>
-        <w:rPr>
-          <w:b/>
-        </w:rPr>
-        <w:t xml:space="preserve">2019 – </w:t>
-      </w:r>
-      <w:r>
-        <w:rPr>
-          <w:b/>
-        </w:rPr>
-        <w:t xml:space="preserve">May </w:t>
-      </w:r>
-      <w:r>
-        <w:rPr>
-          <w:b/>
-        </w:rPr>
-        <w:t>2024</w:t>
-      </w:r>
-      <w:r>
-        <w:t xml:space="preserve"> Graduate Research Assistant</w:t>
-      </w:r>
-    </w:p>
-    <w:p>
-      <w:pPr>
-        <w:ind w:left="270" w:right="90" w:hanging="270"/>
-      </w:pPr>
-      <w:r>
-        <w:t>D</w:t>
-      </w:r>
-      <w:r>
-        <w:rPr>
-          <w:i/>
-          <w:color w:val="000000"/>
-        </w:rPr>
-        <w:t>epartment of Molecular, Cellular, and Biomedical Sciences</w:t>
-      </w:r>
-      <w:r>
-        <w:rPr>
-          <w:i/>
-        </w:rPr>
-        <w:t>, University of New Hampshire</w:t>
-      </w:r>
-      <w:r>
-        <w:t>.</w:t>
-      </w:r>
-      <w:r>
-        <w:t xml:space="preserve"> </w:t>
-      </w:r>
-      <w:r>
-        <w:t>Advisor: Dr. Matthew MacManes</w:t>
-      </w:r>
-    </w:p>
-    <w:p>
-      <w:pPr>
-        <w:ind w:left="270" w:right="90" w:hanging="270"/>
-      </w:pPr>
-      <w:r>
-        <w:t>“Physiological genomics of desert adaptation in Peromyscus”</w:t>
-      </w:r>
-    </w:p>
-    <w:p>
-      <w:pPr>
-        <w:spacing w:after="4" w:line="250" w:lineRule="auto"/>
-        <w:ind w:left="270" w:right="90" w:hanging="270"/>
-        <w:rPr>
-          <w:b/>
-          <w:bCs/>
-        </w:rPr>
-      </w:pPr>
-    </w:p>
-    <w:p>
-      <w:pPr>
-        <w:spacing w:after="4" w:line="250" w:lineRule="auto"/>
-        <w:ind w:left="270" w:right="90" w:hanging="270"/>
-      </w:pPr>
-      <w:r>
-        <w:rPr>
-          <w:b/>
-        </w:rPr>
-        <w:t xml:space="preserve">Aug </w:t>
-      </w:r>
-      <w:r>
-        <w:rPr>
-          <w:b/>
-        </w:rPr>
-        <w:t>2017-</w:t>
-      </w:r>
-      <w:r>
-        <w:rPr>
-          <w:b/>
-        </w:rPr>
-        <w:t xml:space="preserve"> May </w:t>
-      </w:r>
-      <w:r>
-        <w:rPr>
-          <w:b/>
-        </w:rPr>
-        <w:t>2019</w:t>
-      </w:r>
-      <w:r>
-        <w:t xml:space="preserve"> </w:t>
-      </w:r>
-      <w:r>
-        <w:t>Graduate Research Assistant</w:t>
-      </w:r>
-    </w:p>
-    <w:p>
-      <w:pPr>
-        <w:spacing w:after="4" w:line="250" w:lineRule="auto"/>
-        <w:ind w:left="270" w:right="90" w:hanging="270"/>
-      </w:pPr>
-      <w:r>
-        <w:rPr>
-          <w:i/>
-        </w:rPr>
-        <w:t>Wisconsin Cooperative Fisheries Unit, University of</w:t>
-      </w:r>
-      <w:r>
-        <w:rPr>
-          <w:i/>
-        </w:rPr>
-        <w:t xml:space="preserve"> </w:t>
-      </w:r>
-      <w:r>
-        <w:rPr>
-          <w:i/>
-        </w:rPr>
-        <w:t>Wisconsin – Stevens Point</w:t>
-      </w:r>
-    </w:p>
-    <w:p>
-      <w:pPr>
-        <w:ind w:left="270" w:right="90" w:hanging="270"/>
-      </w:pPr>
-      <w:r>
-        <w:t>Advisor: Dr. Wesley Larson</w:t>
-      </w:r>
-    </w:p>
-    <w:p>
-      <w:pPr>
-        <w:ind w:left="270" w:right="90" w:hanging="270"/>
-      </w:pPr>
-      <w:r>
-        <w:t xml:space="preserve">“The first haploid linkage map in a </w:t>
-      </w:r>
-      <w:proofErr w:type="spellStart"/>
-      <w:r>
-        <w:t>coregonid</w:t>
-      </w:r>
-      <w:proofErr w:type="spellEnd"/>
-      <w:r>
-        <w:t xml:space="preserve"> (</w:t>
-      </w:r>
-      <w:r>
-        <w:rPr>
-          <w:i/>
-          <w:iCs/>
-        </w:rPr>
-        <w:t>Coregonus artedi</w:t>
-      </w:r>
-      <w:r>
-        <w:t xml:space="preserve">) improves knowledge of chromosomal evolution and rediploidization across Salmonids” </w:t>
-      </w:r>
-    </w:p>
-    <w:p>
-      <w:pPr>
-        <w:ind w:left="270" w:right="90" w:hanging="270"/>
-      </w:pPr>
     </w:p>
     <w:p>
       <w:pPr>
@@ -3661,27 +3247,17 @@
     </w:p>
     <w:p>
       <w:pPr>
-        <w:ind w:left="270" w:right="90" w:hanging="270"/>
+        <w:ind w:right="90"/>
         <w:rPr>
           <w:b/>
           <w:bCs/>
         </w:rPr>
       </w:pPr>
-    </w:p>
-    <w:p>
-      <w:pPr>
-        <w:ind w:right="90"/>
+      <w:r>
         <w:rPr>
           <w:b/>
           <w:bCs/>
         </w:rPr>
-      </w:pPr>
-      <w:r>
-        <w:rPr>
-          <w:b/>
-          <w:bCs/>
-        </w:rPr>
-        <w:lastRenderedPageBreak/>
         <w:t>PRESENTATIONS</w:t>
       </w:r>
     </w:p>
@@ -3695,47 +3271,16 @@
         <w:ind w:left="270" w:right="90" w:hanging="270"/>
       </w:pPr>
       <w:r>
-        <w:t>Sarah Nicholls, Sarah Couture,</w:t>
-      </w:r>
-      <w:r>
-        <w:rPr>
-          <w:b/>
-          <w:bCs/>
-        </w:rPr>
-        <w:t xml:space="preserve"> </w:t>
-      </w:r>
-      <w:r>
         <w:rPr>
           <w:b/>
           <w:bCs/>
           <w:i/>
           <w:iCs/>
         </w:rPr>
-        <w:t>Blumstein, DM</w:t>
-      </w:r>
-      <w:r>
-        <w:rPr>
-          <w:b/>
-          <w:bCs/>
-        </w:rPr>
-        <w:t>.,</w:t>
-      </w:r>
-      <w:r>
-        <w:t xml:space="preserve"> </w:t>
-      </w:r>
-      <w:proofErr w:type="spellStart"/>
-      <w:r>
-        <w:t>MacManes</w:t>
-      </w:r>
-      <w:proofErr w:type="spellEnd"/>
-      <w:r>
-        <w:t xml:space="preserve"> MD (2024) Using RNA Sequencing to Examine the Dehydration Response in the Hypothalamus and Pituitary Gland of a Desert-Adapted Mouse (poster). </w:t>
-      </w:r>
-      <w:r>
-        <w:rPr>
-          <w:color w:val="auto"/>
-        </w:rPr>
-        <w:t>3rd Joint Congress on Evolutionary Biology. Montreal, QC, Canada</w:t>
+        <w:t>Blumstein DM</w:t>
+      </w:r>
+      <w:r>
+        <w:t>, Patel A, Schiro G, Suzuki T (2026) Beyond distance-decay: The Mississippi River shapes gut microbiome communities in the Peromyscus maniculatus species complex (oral presentation). Beneficial Microbes. Madison, Wisconsin.</w:t>
       </w:r>
     </w:p>
     <w:p>
@@ -3748,53 +3293,31 @@
         <w:ind w:left="270" w:right="90" w:hanging="270"/>
       </w:pPr>
       <w:r>
-        <w:t>Sarah Nicholls, Sarah Couture</w:t>
-      </w:r>
-      <w:r>
-        <w:t>,</w:t>
-      </w:r>
-      <w:r>
-        <w:rPr>
-          <w:b/>
-          <w:bCs/>
-        </w:rPr>
-        <w:t xml:space="preserve"> </w:t>
-      </w:r>
-      <w:r>
         <w:rPr>
           <w:b/>
           <w:bCs/>
           <w:i/>
           <w:iCs/>
         </w:rPr>
-        <w:t>Blumstein, DM</w:t>
-      </w:r>
-      <w:r>
-        <w:rPr>
-          <w:b/>
-          <w:bCs/>
-        </w:rPr>
-        <w:t>.,</w:t>
+        <w:t>Blumstein DM</w:t>
+      </w:r>
+      <w:r>
+        <w:t>, Patel A, Schiro G, Suzuki T (2026) Beyond distance-decay: The Mississippi River shapes gut microbiome communities in the Peromyscus maniculatus species complex</w:t>
       </w:r>
       <w:r>
         <w:t xml:space="preserve"> </w:t>
       </w:r>
-      <w:proofErr w:type="spellStart"/>
-      <w:r>
-        <w:t>MacManes</w:t>
-      </w:r>
-      <w:proofErr w:type="spellEnd"/>
-      <w:r>
-        <w:t xml:space="preserve"> MD (2024) </w:t>
-      </w:r>
-      <w:r>
-        <w:t>Using RNA Sequencing to Examine the Dehydration Response in the Hypothalamus and Pituitary Gland of a Desert-Adapted Mouse</w:t>
-      </w:r>
-      <w:r>
-        <w:t xml:space="preserve"> </w:t>
-      </w:r>
-      <w:r>
-        <w:t>(poster). Undergraduate Research Conference, University of New Hampshire</w:t>
+      <w:r>
+        <w:t>(poster). Fusion 2026 Scientific Retreat. Arizona State University.</w:t>
+      </w:r>
+    </w:p>
+    <w:p>
+      <w:pPr>
+        <w:pStyle w:val="ListParagraph"/>
+        <w:ind w:left="270" w:right="90" w:firstLine="0"/>
+      </w:pPr>
+      <w:r>
+        <w:t>Top ten poster selected for a 90 second rapid talk.</w:t>
       </w:r>
     </w:p>
     <w:p>
@@ -3805,10 +3328,6 @@
           <w:numId w:val="21"/>
         </w:numPr>
         <w:ind w:left="270" w:right="90" w:hanging="270"/>
-        <w:rPr>
-          <w:bCs/>
-          <w:iCs/>
-        </w:rPr>
       </w:pPr>
       <w:r>
         <w:rPr>
@@ -3820,25 +3339,7 @@
         <w:t>Blumstein DM</w:t>
       </w:r>
       <w:r>
-        <w:rPr>
-          <w:b/>
-          <w:bCs/>
-        </w:rPr>
-        <w:t>.,</w:t>
-      </w:r>
-      <w:r>
-        <w:t xml:space="preserve"> </w:t>
-      </w:r>
-      <w:proofErr w:type="spellStart"/>
-      <w:r>
-        <w:t>MacManes</w:t>
-      </w:r>
-      <w:proofErr w:type="spellEnd"/>
-      <w:r>
-        <w:t xml:space="preserve"> MD (2023) When the tap runs dry: The physiological effects of acute experimental dehydration in the desert adapted mouse. American Society of Mammologists, Anchorage, </w:t>
-      </w:r>
-      <w:r>
-        <w:t>Alaska</w:t>
+        <w:t xml:space="preserve">, Patel A, Schiro G, Suzuki T (2026) Beyond distance-decay: The Mississippi River shapes gut microbiome communities in the Peromyscus maniculatus species complex (poster). Arizona and Southern Nevada Branch of the American Society for Microbiology. Tuba City, Arizona </w:t>
       </w:r>
     </w:p>
     <w:p>
@@ -3849,11 +3350,17 @@
           <w:numId w:val="21"/>
         </w:numPr>
         <w:ind w:left="270" w:right="90" w:hanging="270"/>
-        <w:rPr>
+      </w:pPr>
+      <w:r>
+        <w:t>Sarah Nicholls, Sarah Couture,</w:t>
+      </w:r>
+      <w:r>
+        <w:rPr>
+          <w:b/>
           <w:bCs/>
-          <w:iCs/>
-        </w:rPr>
-      </w:pPr>
+        </w:rPr>
+        <w:t xml:space="preserve"> </w:t>
+      </w:r>
       <w:r>
         <w:rPr>
           <w:b/>
@@ -3861,7 +3368,7 @@
           <w:i/>
           <w:iCs/>
         </w:rPr>
-        <w:t>Blumstein DM</w:t>
+        <w:t>Blumstein, DM</w:t>
       </w:r>
       <w:r>
         <w:rPr>
@@ -3879,7 +3386,13 @@
       </w:r>
       <w:proofErr w:type="spellEnd"/>
       <w:r>
-        <w:t xml:space="preserve"> MD (2022) When the tap runs dry: The physiological effects of acute experimental dehydration in the desert adapted mouse. Evolution, Cleveland, Ohio</w:t>
+        <w:t xml:space="preserve"> MD (2024) Using RNA Sequencing to Examine the Dehydration Response in the Hypothalamus and Pituitary Gland of a Desert-Adapted Mouse (poster). </w:t>
+      </w:r>
+      <w:r>
+        <w:rPr>
+          <w:color w:val="auto"/>
+        </w:rPr>
+        <w:t>3rd Joint Congress on Evolutionary Biology. Montreal, QC, Canada</w:t>
       </w:r>
     </w:p>
     <w:p>
@@ -3892,13 +3405,26 @@
         <w:ind w:left="270" w:right="90" w:hanging="270"/>
       </w:pPr>
       <w:r>
+        <w:t>Sarah Nicholls, Sarah Couture</w:t>
+      </w:r>
+      <w:r>
+        <w:t>,</w:t>
+      </w:r>
+      <w:r>
+        <w:rPr>
+          <w:b/>
+          <w:bCs/>
+        </w:rPr>
+        <w:t xml:space="preserve"> </w:t>
+      </w:r>
+      <w:r>
         <w:rPr>
           <w:b/>
           <w:bCs/>
           <w:i/>
           <w:iCs/>
         </w:rPr>
-        <w:t>Blumstein DM</w:t>
+        <w:t>Blumstein, DM</w:t>
       </w:r>
       <w:r>
         <w:rPr>
@@ -3916,14 +3442,16 @@
       </w:r>
       <w:proofErr w:type="spellEnd"/>
       <w:r>
-        <w:t xml:space="preserve"> MD (2022) When the tap runs dry: The physiological effects of acute experimental dehydration in the desert adapted mouse. American Society of Mammologists, Tucson, </w:t>
-      </w:r>
-      <w:r>
-        <w:rPr>
-          <w:bCs/>
-          <w:iCs/>
-        </w:rPr>
-        <w:t>Arizona</w:t>
+        <w:t xml:space="preserve"> MD (2024) </w:t>
+      </w:r>
+      <w:r>
+        <w:t>Using RNA Sequencing to Examine the Dehydration Response in the Hypothalamus and Pituitary Gland of a Desert-Adapted Mouse</w:t>
+      </w:r>
+      <w:r>
+        <w:t xml:space="preserve"> </w:t>
+      </w:r>
+      <w:r>
+        <w:t>(poster). Undergraduate Research Conference, University of New Hampshire</w:t>
       </w:r>
     </w:p>
     <w:p>
@@ -3934,17 +3462,11 @@
           <w:numId w:val="21"/>
         </w:numPr>
         <w:ind w:left="270" w:right="90" w:hanging="270"/>
-      </w:pPr>
-      <w:r>
-        <w:t>Donatelli C.,</w:t>
-      </w:r>
-      <w:r>
-        <w:rPr>
-          <w:b/>
+        <w:rPr>
           <w:bCs/>
-        </w:rPr>
-        <w:t xml:space="preserve"> </w:t>
-      </w:r>
+          <w:iCs/>
+        </w:rPr>
+      </w:pPr>
       <w:r>
         <w:rPr>
           <w:b/>
@@ -3952,7 +3474,8 @@
           <w:i/>
           <w:iCs/>
         </w:rPr>
-        <w:t>Blumstein, DM</w:t>
+        <w:lastRenderedPageBreak/>
+        <w:t>Blumstein DM</w:t>
       </w:r>
       <w:r>
         <w:rPr>
@@ -3970,39 +3493,10 @@
       </w:r>
       <w:proofErr w:type="spellEnd"/>
       <w:r>
-        <w:t xml:space="preserve"> MD (2022) Changes in gene expression in the cactus mouse (</w:t>
-      </w:r>
-      <w:r>
-        <w:rPr>
-          <w:i/>
-          <w:iCs/>
-        </w:rPr>
-        <w:t xml:space="preserve">Peromyscus </w:t>
-      </w:r>
-      <w:proofErr w:type="spellStart"/>
-      <w:r>
-        <w:rPr>
-          <w:i/>
-          <w:iCs/>
-        </w:rPr>
-        <w:t>eremicus</w:t>
-      </w:r>
-      <w:proofErr w:type="spellEnd"/>
-      <w:r>
-        <w:rPr>
-          <w:i/>
-          <w:iCs/>
-        </w:rPr>
-        <w:t xml:space="preserve">) </w:t>
-      </w:r>
-      <w:r>
-        <w:t>due to diet composition</w:t>
-      </w:r>
-      <w:r>
-        <w:t xml:space="preserve"> (poster)</w:t>
-      </w:r>
-      <w:r>
-        <w:t>. Undergraduate Research Conference, University of New Hampshire</w:t>
+        <w:t xml:space="preserve"> MD (2023) When the tap runs dry: The physiological effects of acute experimental dehydration in the desert adapted mouse. American Society of Mammologists, Anchorage, </w:t>
+      </w:r>
+      <w:r>
+        <w:t>Alaska</w:t>
       </w:r>
     </w:p>
     <w:p>
@@ -4043,13 +3537,7 @@
       </w:r>
       <w:proofErr w:type="spellEnd"/>
       <w:r>
-        <w:t xml:space="preserve"> MD (2022) When the tap runs dry: The physiological effects of acute experimental dehydration in the desert adapted mouse</w:t>
-      </w:r>
-      <w:r>
-        <w:t xml:space="preserve"> (poster)</w:t>
-      </w:r>
-      <w:r>
-        <w:t>. Graduate Research Conference, University of New Hampshire</w:t>
+        <w:t xml:space="preserve"> MD (2022) When the tap runs dry: The physiological effects of acute experimental dehydration in the desert adapted mouse. Evolution, Cleveland, Ohio</w:t>
       </w:r>
     </w:p>
     <w:p>
@@ -4060,41 +3548,40 @@
           <w:numId w:val="21"/>
         </w:numPr>
         <w:ind w:left="270" w:right="90" w:hanging="270"/>
+      </w:pPr>
+      <w:r>
+        <w:rPr>
+          <w:b/>
+          <w:bCs/>
+          <w:i/>
+          <w:iCs/>
+        </w:rPr>
+        <w:t>Blumstein DM</w:t>
+      </w:r>
+      <w:r>
+        <w:rPr>
+          <w:b/>
+          <w:bCs/>
+        </w:rPr>
+        <w:t>.,</w:t>
+      </w:r>
+      <w:r>
+        <w:t xml:space="preserve"> </w:t>
+      </w:r>
+      <w:proofErr w:type="spellStart"/>
+      <w:r>
+        <w:t>MacManes</w:t>
+      </w:r>
+      <w:proofErr w:type="spellEnd"/>
+      <w:r>
+        <w:t xml:space="preserve"> MD (2022) When the tap runs dry: The physiological effects of acute experimental dehydration in the desert adapted mouse. American Society of Mammologists, Tucson, </w:t>
+      </w:r>
+      <w:r>
         <w:rPr>
           <w:bCs/>
           <w:iCs/>
         </w:rPr>
-      </w:pPr>
-      <w:r>
-        <w:rPr>
-          <w:b/>
-          <w:bCs/>
-        </w:rPr>
-        <w:t>Blumstein DM.,</w:t>
-      </w:r>
-      <w:r>
-        <w:t xml:space="preserve"> </w:t>
-      </w:r>
-      <w:proofErr w:type="spellStart"/>
-      <w:r>
-        <w:t>MacManes</w:t>
-      </w:r>
-      <w:proofErr w:type="spellEnd"/>
-      <w:r>
-        <w:t xml:space="preserve"> </w:t>
-      </w:r>
-      <w:r>
-        <w:t xml:space="preserve">MD </w:t>
-      </w:r>
-      <w:r>
-        <w:t xml:space="preserve">(2022) When the tap runs dry: The physiological effects of acute experimental dehydration in the desert adapted mouse. The Society for Integrative &amp; Comparative Biology Annual Meeting. </w:t>
-      </w:r>
-      <w:r>
-        <w:rPr>
-          <w:bCs/>
-          <w:iCs/>
-        </w:rPr>
-        <w:t>Phoenix, Arizona</w:t>
+        <w:t>Arizona</w:t>
       </w:r>
     </w:p>
     <w:p>
@@ -4107,14 +3594,73 @@
         <w:ind w:left="270" w:right="90" w:hanging="270"/>
       </w:pPr>
       <w:r>
-        <w:rPr>
-          <w:b/>
+        <w:t>Donatelli C.,</w:t>
+      </w:r>
+      <w:r>
+        <w:rPr>
+          <w:b/>
+          <w:bCs/>
+        </w:rPr>
+        <w:t xml:space="preserve"> </w:t>
+      </w:r>
+      <w:r>
+        <w:rPr>
+          <w:b/>
+          <w:bCs/>
           <w:i/>
-        </w:rPr>
-        <w:t>Blumstein DM.</w:t>
-      </w:r>
-      <w:r>
-        <w:t xml:space="preserve"> (2021). When the tap runs dry: The physiological effects of acute experimental dehydration in the desert adapted mouse. Molecular, Cellular, Biomedical Sciences, University of New Hampshire</w:t>
+          <w:iCs/>
+        </w:rPr>
+        <w:t>Blumstein, DM</w:t>
+      </w:r>
+      <w:r>
+        <w:rPr>
+          <w:b/>
+          <w:bCs/>
+        </w:rPr>
+        <w:t>.,</w:t>
+      </w:r>
+      <w:r>
+        <w:t xml:space="preserve"> </w:t>
+      </w:r>
+      <w:proofErr w:type="spellStart"/>
+      <w:r>
+        <w:t>MacManes</w:t>
+      </w:r>
+      <w:proofErr w:type="spellEnd"/>
+      <w:r>
+        <w:t xml:space="preserve"> MD (2022) Changes in gene expression in the cactus mouse (</w:t>
+      </w:r>
+      <w:r>
+        <w:rPr>
+          <w:i/>
+          <w:iCs/>
+        </w:rPr>
+        <w:t xml:space="preserve">Peromyscus </w:t>
+      </w:r>
+      <w:proofErr w:type="spellStart"/>
+      <w:r>
+        <w:rPr>
+          <w:i/>
+          <w:iCs/>
+        </w:rPr>
+        <w:t>eremicus</w:t>
+      </w:r>
+      <w:proofErr w:type="spellEnd"/>
+      <w:r>
+        <w:rPr>
+          <w:i/>
+          <w:iCs/>
+        </w:rPr>
+        <w:t xml:space="preserve">) </w:t>
+      </w:r>
+      <w:r>
+        <w:t>due to diet composition</w:t>
+      </w:r>
+      <w:r>
+        <w:t xml:space="preserve"> (poster)</w:t>
+      </w:r>
+      <w:r>
+        <w:t>. Undergraduate Research Conference, University of New Hampshire</w:t>
       </w:r>
     </w:p>
     <w:p>
@@ -4125,6 +3671,10 @@
           <w:numId w:val="21"/>
         </w:numPr>
         <w:ind w:left="270" w:right="90" w:hanging="270"/>
+        <w:rPr>
+          <w:bCs/>
+          <w:iCs/>
+        </w:rPr>
       </w:pPr>
       <w:r>
         <w:rPr>
@@ -4133,23 +3683,17 @@
           <w:i/>
           <w:iCs/>
         </w:rPr>
-        <w:t>Blumstein DM.</w:t>
+        <w:t>Blumstein DM</w:t>
       </w:r>
       <w:r>
         <w:rPr>
           <w:b/>
           <w:bCs/>
         </w:rPr>
-        <w:t>,</w:t>
-      </w:r>
-      <w:r>
-        <w:t xml:space="preserve"> Colella</w:t>
-      </w:r>
-      <w:r>
-        <w:t xml:space="preserve"> JP.</w:t>
-      </w:r>
-      <w:r>
-        <w:t xml:space="preserve">, </w:t>
+        <w:t>.,</w:t>
+      </w:r>
+      <w:r>
+        <w:t xml:space="preserve"> </w:t>
       </w:r>
       <w:proofErr w:type="spellStart"/>
       <w:r>
@@ -4157,13 +3701,13 @@
       </w:r>
       <w:proofErr w:type="spellEnd"/>
       <w:r>
-        <w:t xml:space="preserve"> </w:t>
-      </w:r>
-      <w:r>
-        <w:t xml:space="preserve">MD </w:t>
-      </w:r>
-      <w:r>
-        <w:t>(2021). Food for thought: Evaporative water loss driven by low-fat diet in desert-adapted mice (poster). Annual Meeting of the American Society of Mammologists, Virtual Conference Platform</w:t>
+        <w:t xml:space="preserve"> MD (2022) When the tap runs dry: The physiological effects of acute experimental dehydration in the desert adapted mouse</w:t>
+      </w:r>
+      <w:r>
+        <w:t xml:space="preserve"> (poster)</w:t>
+      </w:r>
+      <w:r>
+        <w:t>. Graduate Research Conference, University of New Hampshire</w:t>
       </w:r>
     </w:p>
     <w:p>
@@ -4174,26 +3718,41 @@
           <w:numId w:val="21"/>
         </w:numPr>
         <w:ind w:left="270" w:right="90" w:hanging="270"/>
-      </w:pPr>
-      <w:r>
-        <w:rPr>
-          <w:b/>
-          <w:i/>
+        <w:rPr>
+          <w:bCs/>
+          <w:iCs/>
+        </w:rPr>
+      </w:pPr>
+      <w:r>
+        <w:rPr>
+          <w:b/>
+          <w:bCs/>
         </w:rPr>
         <w:t>Blumstein DM.,</w:t>
       </w:r>
       <w:r>
-        <w:t xml:space="preserve"> Campbell, MA., Hale, MC., Sutherland, BJ., McKinney, GJ., Stott, W., &amp; Larson, WA. (2019). Comparative genomic analyses and a novel linkage map for cisco (</w:t>
-      </w:r>
-      <w:r>
-        <w:rPr>
-          <w:i/>
+        <w:t xml:space="preserve"> </w:t>
+      </w:r>
+      <w:proofErr w:type="spellStart"/>
+      <w:r>
+        <w:t>MacManes</w:t>
+      </w:r>
+      <w:proofErr w:type="spellEnd"/>
+      <w:r>
+        <w:t xml:space="preserve"> </w:t>
+      </w:r>
+      <w:r>
+        <w:t xml:space="preserve">MD </w:t>
+      </w:r>
+      <w:r>
+        <w:t xml:space="preserve">(2022) When the tap runs dry: The physiological effects of acute experimental dehydration in the desert adapted mouse. The Society for Integrative &amp; Comparative Biology Annual Meeting. </w:t>
+      </w:r>
+      <w:r>
+        <w:rPr>
+          <w:bCs/>
           <w:iCs/>
         </w:rPr>
-        <w:t>Coregonus artedi</w:t>
-      </w:r>
-      <w:r>
-        <w:t>) provides insight into chromosomal evolution and rediploidization across salmonids. Hubbard Genome Center, University of New Hampshire</w:t>
+        <w:t>Phoenix, Arizona</w:t>
       </w:r>
     </w:p>
     <w:p>
@@ -4210,27 +3769,10 @@
           <w:b/>
           <w:i/>
         </w:rPr>
-        <w:t>Blumstein DM</w:t>
-      </w:r>
-      <w:r>
-        <w:t xml:space="preserve">. (2019). The first haploid linkage map in a </w:t>
-      </w:r>
-      <w:proofErr w:type="spellStart"/>
-      <w:r>
-        <w:t>coregonid</w:t>
-      </w:r>
-      <w:proofErr w:type="spellEnd"/>
-      <w:r>
-        <w:t xml:space="preserve"> (</w:t>
-      </w:r>
-      <w:r>
-        <w:rPr>
-          <w:i/>
-        </w:rPr>
-        <w:t>Coregonus artedi</w:t>
-      </w:r>
-      <w:r>
-        <w:t xml:space="preserve">) improves knowledge of chromosomal evolution and rediploidization across Salmonids. International Association for Great Lakes Research 62nd Annual Conference on Great Lakes Research. The College at Brockport, State University of New York </w:t>
+        <w:t>Blumstein DM.</w:t>
+      </w:r>
+      <w:r>
+        <w:t xml:space="preserve"> (2021). When the tap runs dry: The physiological effects of acute experimental dehydration in the desert adapted mouse. Molecular, Cellular, Biomedical Sciences, University of New Hampshire</w:t>
       </w:r>
     </w:p>
     <w:p>
@@ -4245,45 +3787,41 @@
       <w:r>
         <w:rPr>
           <w:b/>
+          <w:bCs/>
           <w:i/>
-        </w:rPr>
-        <w:t>Blumstein DM</w:t>
-      </w:r>
-      <w:r>
-        <w:t xml:space="preserve">. (2019). The first haploid linkage map in a </w:t>
+          <w:iCs/>
+        </w:rPr>
+        <w:t>Blumstein DM.</w:t>
+      </w:r>
+      <w:r>
+        <w:rPr>
+          <w:b/>
+          <w:bCs/>
+        </w:rPr>
+        <w:t>,</w:t>
+      </w:r>
+      <w:r>
+        <w:t xml:space="preserve"> Colella</w:t>
+      </w:r>
+      <w:r>
+        <w:t xml:space="preserve"> JP.</w:t>
+      </w:r>
+      <w:r>
+        <w:t xml:space="preserve">, </w:t>
       </w:r>
       <w:proofErr w:type="spellStart"/>
       <w:r>
-        <w:t>coregonid</w:t>
+        <w:t>MacManes</w:t>
       </w:r>
       <w:proofErr w:type="spellEnd"/>
       <w:r>
-        <w:t xml:space="preserve"> (</w:t>
-      </w:r>
-      <w:r>
-        <w:rPr>
-          <w:i/>
-        </w:rPr>
-        <w:t>Coregonus artedi</w:t>
-      </w:r>
-      <w:r>
-        <w:t>) improves knowledge of chromosomal evolution and rediploidization across Salmonids. Master's thesis</w:t>
-      </w:r>
-      <w:r>
-        <w:rPr>
-          <w:rFonts w:ascii="Arial" w:eastAsia="Arial" w:hAnsi="Arial" w:cs="Arial"/>
-          <w:color w:val="212121"/>
-        </w:rPr>
-        <w:t xml:space="preserve">. </w:t>
-      </w:r>
-      <w:r>
-        <w:t>University of Wisconsin</w:t>
-      </w:r>
-      <w:r>
         <w:t xml:space="preserve"> </w:t>
       </w:r>
       <w:r>
-        <w:t>Stevens Point</w:t>
+        <w:t xml:space="preserve">MD </w:t>
+      </w:r>
+      <w:r>
+        <w:t>(2021). Food for thought: Evaporative water loss driven by low-fat diet in desert-adapted mice (poster). Annual Meeting of the American Society of Mammologists, Virtual Conference Platform</w:t>
       </w:r>
     </w:p>
     <w:p>
@@ -4300,19 +3838,20 @@
           <w:b/>
           <w:i/>
         </w:rPr>
-        <w:t>Blumstein DM</w:t>
-      </w:r>
-      <w:r>
-        <w:t>, Stott W, Larson WA (2019) Development of a genetic linkage map for cisco (</w:t>
+        <w:t>Blumstein DM.,</w:t>
+      </w:r>
+      <w:r>
+        <w:t xml:space="preserve"> Campbell, MA., Hale, MC., Sutherland, BJ., McKinney, GJ., Stott, W., &amp; Larson, WA. (2019). Comparative genomic analyses and a novel linkage map for cisco (</w:t>
       </w:r>
       <w:r>
         <w:rPr>
           <w:i/>
+          <w:iCs/>
         </w:rPr>
         <w:t>Coregonus artedi</w:t>
       </w:r>
       <w:r>
-        <w:t>) to facilitate integrated studies of adaptive diversity (poster). 47th Annual Meeting of the Wisconsin Chapter of the American Fisheries Society. Green Bay, Wisconsin</w:t>
+        <w:t>) provides insight into chromosomal evolution and rediploidization across salmonids. Hubbard Genome Center, University of New Hampshire</w:t>
       </w:r>
     </w:p>
     <w:p>
@@ -4332,7 +3871,15 @@
         <w:t>Blumstein DM</w:t>
       </w:r>
       <w:r>
-        <w:t>, Stott W, Larson WA (2018) Development of a genetic linkage map for cisco (</w:t>
+        <w:t xml:space="preserve">. (2019). The first haploid linkage map in a </w:t>
+      </w:r>
+      <w:proofErr w:type="spellStart"/>
+      <w:r>
+        <w:t>coregonid</w:t>
+      </w:r>
+      <w:proofErr w:type="spellEnd"/>
+      <w:r>
+        <w:t xml:space="preserve"> (</w:t>
       </w:r>
       <w:r>
         <w:rPr>
@@ -4341,16 +3888,8 @@
         <w:t>Coregonus artedi</w:t>
       </w:r>
       <w:r>
-        <w:t xml:space="preserve">) to facilitate integrated studies of adaptive diversity. </w:t>
-      </w:r>
-      <w:r>
-        <w:t xml:space="preserve">Coastwide Salmonid Genetics Meeting, </w:t>
-      </w:r>
-      <w:hyperlink r:id="rId10" w:tgtFrame="_blank" w:history="1">
-        <w:r>
-          <w:t>Mukilteo, Washington</w:t>
-        </w:r>
-      </w:hyperlink>
+        <w:t xml:space="preserve">) improves knowledge of chromosomal evolution and rediploidization across Salmonids. International Association for Great Lakes Research 62nd Annual Conference on Great Lakes Research. The College at Brockport, State University of New York </w:t>
+      </w:r>
     </w:p>
     <w:p>
       <w:pPr>
@@ -4366,11 +3905,18 @@
           <w:b/>
           <w:i/>
         </w:rPr>
-        <w:lastRenderedPageBreak/>
         <w:t>Blumstein DM</w:t>
       </w:r>
       <w:r>
-        <w:t>, Stott W, Larson WA (2018) Development of a genetic linkage map for cisco (</w:t>
+        <w:t xml:space="preserve">. (2019). The first haploid linkage map in a </w:t>
+      </w:r>
+      <w:proofErr w:type="spellStart"/>
+      <w:r>
+        <w:t>coregonid</w:t>
+      </w:r>
+      <w:proofErr w:type="spellEnd"/>
+      <w:r>
+        <w:t xml:space="preserve"> (</w:t>
       </w:r>
       <w:r>
         <w:rPr>
@@ -4379,16 +3925,23 @@
         <w:t>Coregonus artedi</w:t>
       </w:r>
       <w:r>
-        <w:t xml:space="preserve">) to facilitate integrated studies of adaptive diversity. USGS Great Lakes Science Center, Ann Arbor, Michigan. </w:t>
-      </w:r>
-      <w:r>
-        <w:rPr>
-          <w:i/>
-        </w:rPr>
-        <w:t>Invited Seminar</w:t>
-      </w:r>
-      <w:r>
-        <w:t xml:space="preserve">  </w:t>
+        <w:t>) improves knowledge of chromosomal evolution and rediploidization across Salmonids. Master's thesis</w:t>
+      </w:r>
+      <w:r>
+        <w:rPr>
+          <w:rFonts w:ascii="Arial" w:eastAsia="Arial" w:hAnsi="Arial" w:cs="Arial"/>
+          <w:color w:val="212121"/>
+        </w:rPr>
+        <w:t xml:space="preserve">. </w:t>
+      </w:r>
+      <w:r>
+        <w:t>University of Wisconsin</w:t>
+      </w:r>
+      <w:r>
+        <w:t xml:space="preserve"> </w:t>
+      </w:r>
+      <w:r>
+        <w:t>Stevens Point</w:t>
       </w:r>
     </w:p>
     <w:p>
@@ -4408,7 +3961,7 @@
         <w:t>Blumstein DM</w:t>
       </w:r>
       <w:r>
-        <w:t>, Stott W, Larson WA (2018) Development of a genetic linkage map for cisco (</w:t>
+        <w:t>, Stott W, Larson WA (2019) Development of a genetic linkage map for cisco (</w:t>
       </w:r>
       <w:r>
         <w:rPr>
@@ -4417,7 +3970,7 @@
         <w:t>Coregonus artedi</w:t>
       </w:r>
       <w:r>
-        <w:t>) to facilitate integrated studies of adaptive diversity (poster). Midwest Fish and Wildlife Conference. Milwaukee, Wisconsin</w:t>
+        <w:t>) to facilitate integrated studies of adaptive diversity (poster). 47th Annual Meeting of the Wisconsin Chapter of the American Fisheries Society. Green Bay, Wisconsin</w:t>
       </w:r>
     </w:p>
     <w:p>
@@ -4437,6 +3990,110 @@
         <w:t>Blumstein DM</w:t>
       </w:r>
       <w:r>
+        <w:t>, Stott W, Larson WA (2018) Development of a genetic linkage map for cisco (</w:t>
+      </w:r>
+      <w:r>
+        <w:rPr>
+          <w:i/>
+        </w:rPr>
+        <w:t>Coregonus artedi</w:t>
+      </w:r>
+      <w:r>
+        <w:t xml:space="preserve">) to facilitate integrated studies of adaptive diversity. </w:t>
+      </w:r>
+      <w:r>
+        <w:t xml:space="preserve">Coastwide Salmonid Genetics Meeting, </w:t>
+      </w:r>
+      <w:hyperlink r:id="rId11" w:tgtFrame="_blank" w:history="1">
+        <w:r>
+          <w:t>Mukilteo, Washington</w:t>
+        </w:r>
+      </w:hyperlink>
+    </w:p>
+    <w:p>
+      <w:pPr>
+        <w:pStyle w:val="ListParagraph"/>
+        <w:numPr>
+          <w:ilvl w:val="0"/>
+          <w:numId w:val="21"/>
+        </w:numPr>
+        <w:ind w:left="270" w:right="90" w:hanging="270"/>
+      </w:pPr>
+      <w:r>
+        <w:rPr>
+          <w:b/>
+          <w:i/>
+        </w:rPr>
+        <w:t>Blumstein DM</w:t>
+      </w:r>
+      <w:r>
+        <w:t>, Stott W, Larson WA (2018) Development of a genetic linkage map for cisco (</w:t>
+      </w:r>
+      <w:r>
+        <w:rPr>
+          <w:i/>
+        </w:rPr>
+        <w:t>Coregonus artedi</w:t>
+      </w:r>
+      <w:r>
+        <w:t xml:space="preserve">) to facilitate integrated studies of adaptive diversity. USGS Great Lakes Science Center, Ann Arbor, Michigan. </w:t>
+      </w:r>
+      <w:r>
+        <w:rPr>
+          <w:i/>
+        </w:rPr>
+        <w:t>Invited Seminar</w:t>
+      </w:r>
+      <w:r>
+        <w:t xml:space="preserve">  </w:t>
+      </w:r>
+    </w:p>
+    <w:p>
+      <w:pPr>
+        <w:pStyle w:val="ListParagraph"/>
+        <w:numPr>
+          <w:ilvl w:val="0"/>
+          <w:numId w:val="21"/>
+        </w:numPr>
+        <w:ind w:left="270" w:right="90" w:hanging="270"/>
+      </w:pPr>
+      <w:r>
+        <w:rPr>
+          <w:b/>
+          <w:i/>
+        </w:rPr>
+        <w:t>Blumstein DM</w:t>
+      </w:r>
+      <w:r>
+        <w:t>, Stott W, Larson WA (2018) Development of a genetic linkage map for cisco (</w:t>
+      </w:r>
+      <w:r>
+        <w:rPr>
+          <w:i/>
+        </w:rPr>
+        <w:t>Coregonus artedi</w:t>
+      </w:r>
+      <w:r>
+        <w:t>) to facilitate integrated studies of adaptive diversity (poster). Midwest Fish and Wildlife Conference. Milwaukee, Wisconsin</w:t>
+      </w:r>
+    </w:p>
+    <w:p>
+      <w:pPr>
+        <w:pStyle w:val="ListParagraph"/>
+        <w:numPr>
+          <w:ilvl w:val="0"/>
+          <w:numId w:val="21"/>
+        </w:numPr>
+        <w:ind w:left="270" w:right="90" w:hanging="270"/>
+      </w:pPr>
+      <w:r>
+        <w:rPr>
+          <w:b/>
+          <w:i/>
+        </w:rPr>
+        <w:t>Blumstein DM</w:t>
+      </w:r>
+      <w:r>
         <w:t>, Mays D, Scribner KT (2017) Spatial genetic structure and recruitment dynamics of burbot (</w:t>
       </w:r>
       <w:r>
@@ -4456,17 +4113,11 @@
       </w:r>
     </w:p>
     <w:p>
-      <w:r>
-        <w:br w:type="page"/>
-      </w:r>
-    </w:p>
-    <w:p>
-      <w:pPr>
-        <w:ind w:right="-5"/>
+      <w:pPr>
         <w:sectPr>
-          <w:headerReference w:type="even" r:id="rId11"/>
-          <w:headerReference w:type="default" r:id="rId12"/>
-          <w:headerReference w:type="first" r:id="rId13"/>
+          <w:headerReference w:type="even" r:id="rId12"/>
+          <w:headerReference w:type="default" r:id="rId13"/>
+          <w:headerReference w:type="first" r:id="rId14"/>
           <w:pgSz w:w="12240" w:h="15840"/>
           <w:pgMar w:top="504" w:right="630" w:bottom="846" w:left="720" w:header="720" w:footer="720" w:gutter="0"/>
           <w:cols w:space="698"/>
@@ -5145,7 +4796,7 @@
           <w:sz w:val="22"/>
           <w:szCs w:val="22"/>
         </w:rPr>
-        <w:t>Mouse colony management</w:t>
+        <w:t>Small mammal trapping and ear tagging</w:t>
       </w:r>
     </w:p>
     <w:p>
@@ -5157,18 +4808,16 @@
         <w:spacing w:after="39"/>
         <w:ind w:right="175" w:hanging="360"/>
         <w:rPr>
-          <w:i/>
-          <w:iCs/>
-          <w:sz w:val="22"/>
-          <w:szCs w:val="22"/>
-        </w:rPr>
-      </w:pPr>
-      <w:r>
-        <w:rPr>
-          <w:sz w:val="22"/>
-          <w:szCs w:val="22"/>
-        </w:rPr>
-        <w:t>Small mammal trapping</w:t>
+          <w:sz w:val="22"/>
+          <w:szCs w:val="22"/>
+        </w:rPr>
+      </w:pPr>
+      <w:r>
+        <w:rPr>
+          <w:sz w:val="22"/>
+          <w:szCs w:val="22"/>
+        </w:rPr>
+        <w:t>Mouse colony management</w:t>
       </w:r>
     </w:p>
     <w:p>
@@ -5191,6 +4840,29 @@
           <w:sz w:val="22"/>
           <w:szCs w:val="22"/>
         </w:rPr>
+        <w:t>Small mammal trapping</w:t>
+      </w:r>
+    </w:p>
+    <w:p>
+      <w:pPr>
+        <w:numPr>
+          <w:ilvl w:val="0"/>
+          <w:numId w:val="2"/>
+        </w:numPr>
+        <w:spacing w:after="39"/>
+        <w:ind w:right="175" w:hanging="360"/>
+        <w:rPr>
+          <w:i/>
+          <w:iCs/>
+          <w:sz w:val="22"/>
+          <w:szCs w:val="22"/>
+        </w:rPr>
+      </w:pPr>
+      <w:r>
+        <w:rPr>
+          <w:sz w:val="22"/>
+          <w:szCs w:val="22"/>
+        </w:rPr>
         <w:t xml:space="preserve">Desert mouse identification </w:t>
       </w:r>
     </w:p>
@@ -5239,6 +4911,26 @@
     </w:p>
     <w:p>
       <w:pPr>
+        <w:numPr>
+          <w:ilvl w:val="0"/>
+          <w:numId w:val="2"/>
+        </w:numPr>
+        <w:ind w:right="175" w:hanging="360"/>
+        <w:rPr>
+          <w:sz w:val="22"/>
+          <w:szCs w:val="22"/>
+        </w:rPr>
+      </w:pPr>
+      <w:r>
+        <w:rPr>
+          <w:sz w:val="22"/>
+          <w:szCs w:val="22"/>
+        </w:rPr>
+        <w:t>Study skin prep for Peromyscus</w:t>
+      </w:r>
+    </w:p>
+    <w:p>
+      <w:pPr>
         <w:spacing w:after="39"/>
         <w:ind w:right="175"/>
         <w:rPr>
@@ -5398,6 +5090,66 @@
         </w:rPr>
         <w:t xml:space="preserve">Fish care and fish feeding, fish disease prevention, identification, and treatment </w:t>
       </w:r>
+    </w:p>
+    <w:p>
+      <w:pPr>
+        <w:ind w:right="175"/>
+        <w:rPr>
+          <w:i/>
+          <w:sz w:val="22"/>
+          <w:szCs w:val="22"/>
+        </w:rPr>
+      </w:pPr>
+    </w:p>
+    <w:p>
+      <w:pPr>
+        <w:ind w:right="175"/>
+        <w:rPr>
+          <w:i/>
+          <w:sz w:val="22"/>
+          <w:szCs w:val="22"/>
+        </w:rPr>
+      </w:pPr>
+    </w:p>
+    <w:p>
+      <w:pPr>
+        <w:ind w:right="175"/>
+        <w:rPr>
+          <w:i/>
+          <w:sz w:val="22"/>
+          <w:szCs w:val="22"/>
+        </w:rPr>
+      </w:pPr>
+    </w:p>
+    <w:p>
+      <w:pPr>
+        <w:ind w:right="175"/>
+        <w:rPr>
+          <w:i/>
+          <w:sz w:val="22"/>
+          <w:szCs w:val="22"/>
+        </w:rPr>
+      </w:pPr>
+    </w:p>
+    <w:p>
+      <w:pPr>
+        <w:ind w:right="175"/>
+        <w:rPr>
+          <w:i/>
+          <w:sz w:val="22"/>
+          <w:szCs w:val="22"/>
+        </w:rPr>
+      </w:pPr>
+    </w:p>
+    <w:p>
+      <w:pPr>
+        <w:ind w:right="175"/>
+        <w:rPr>
+          <w:i/>
+          <w:sz w:val="22"/>
+          <w:szCs w:val="22"/>
+        </w:rPr>
+      </w:pPr>
     </w:p>
     <w:p>
       <w:pPr>
@@ -6565,7 +6317,7 @@
 </file>
 
 <file path=word/endnotes.xml><?xml version="1.0" encoding="utf-8"?>
-<w:endnotes xmlns:wpc="http://schemas.microsoft.com/office/word/2010/wordprocessingCanvas" xmlns:cx="http://schemas.microsoft.com/office/drawing/2014/chartex" xmlns:cx1="http://schemas.microsoft.com/office/drawing/2015/9/8/chartex" xmlns:cx2="http://schemas.microsoft.com/office/drawing/2015/10/21/chartex" xmlns:cx3="http://schemas.microsoft.com/office/drawing/2016/5/9/chartex" xmlns:cx4="http://schemas.microsoft.com/office/drawing/2016/5/10/chartex" xmlns:cx5="http://schemas.microsoft.com/office/drawing/2016/5/11/chartex" xmlns:cx6="http://schemas.microsoft.com/office/drawing/2016/5/12/chartex" xmlns:cx7="http://schemas.microsoft.com/office/drawing/2016/5/13/chartex" xmlns:cx8="http://schemas.microsoft.com/office/drawing/2016/5/14/chartex" xmlns:mc="http://schemas.openxmlformats.org/markup-compatibility/2006" xmlns:aink="http://schemas.microsoft.com/office/drawing/2016/ink" xmlns:am3d="http://schemas.microsoft.com/office/drawing/2017/model3d" xmlns:o="urn:schemas-microsoft-com:office:office" xmlns:oel="http://schemas.microsoft.com/office/2019/extlst" xmlns:r="http://schemas.openxmlformats.org/officeDocument/2006/relationships" xmlns:m="http://schemas.openxmlformats.org/officeDocument/2006/math" xmlns:v="urn:schemas-microsoft-com:vml" xmlns:wp14="http://schemas.microsoft.com/office/word/2010/wordprocessingDrawing" xmlns:wp="http://schemas.openxmlformats.org/drawingml/2006/wordprocessingDrawing" xmlns:w10="urn:schemas-microsoft-com:office:word" xmlns:w="http://schemas.openxmlformats.org/wordprocessingml/2006/main" xmlns:w14="http://schemas.microsoft.com/office/word/2010/wordml" xmlns:w15="http://schemas.microsoft.com/office/word/2012/wordml" xmlns:w16cex="http://schemas.microsoft.com/office/word/2018/wordml/cex" xmlns:w16cid="http://schemas.microsoft.com/office/word/2016/wordml/cid" xmlns:w16="http://schemas.microsoft.com/office/word/2018/wordml" xmlns:w16du="http://schemas.microsoft.com/office/word/2023/wordml/word16du" xmlns:w16sdtdh="http://schemas.microsoft.com/office/word/2020/wordml/sdtdatahash" xmlns:w16sdtfl="http://schemas.microsoft.com/office/word/2024/wordml/sdtformatlock" xmlns:w16se="http://schemas.microsoft.com/office/word/2015/wordml/symex" xmlns:wpg="http://schemas.microsoft.com/office/word/2010/wordprocessingGroup" xmlns:wpi="http://schemas.microsoft.com/office/word/2010/wordprocessingInk" xmlns:wne="http://schemas.microsoft.com/office/word/2006/wordml" xmlns:wps="http://schemas.microsoft.com/office/word/2010/wordprocessingShape" mc:Ignorable="w14 w15 w16se w16cid w16 w16cex w16sdtdh w16sdtfl w16du wp14">
+<w:endnotes xmlns:wpc="http://schemas.microsoft.com/office/word/2010/wordprocessingCanvas" xmlns:cx="http://schemas.microsoft.com/office/drawing/2014/chartex" xmlns:cx1="http://schemas.microsoft.com/office/drawing/2015/9/8/chartex" xmlns:cx2="http://schemas.microsoft.com/office/drawing/2015/10/21/chartex" xmlns:cx3="http://schemas.microsoft.com/office/drawing/2016/5/9/chartex" xmlns:cx4="http://schemas.microsoft.com/office/drawing/2016/5/10/chartex" xmlns:cx5="http://schemas.microsoft.com/office/drawing/2016/5/11/chartex" xmlns:cx6="http://schemas.microsoft.com/office/drawing/2016/5/12/chartex" xmlns:cx7="http://schemas.microsoft.com/office/drawing/2016/5/13/chartex" xmlns:cx8="http://schemas.microsoft.com/office/drawing/2016/5/14/chartex" xmlns:mc="http://schemas.openxmlformats.org/markup-compatibility/2006" xmlns:m="http://schemas.openxmlformats.org/officeDocument/2006/math" xmlns:aink="http://schemas.microsoft.com/office/drawing/2016/ink" xmlns:am3d="http://schemas.microsoft.com/office/drawing/2017/model3d" xmlns:oel="http://schemas.microsoft.com/office/2019/extlst" xmlns:r="http://schemas.openxmlformats.org/officeDocument/2006/relationships" xmlns:wp14="http://schemas.microsoft.com/office/word/2010/wordprocessingDrawing" xmlns:wp="http://schemas.openxmlformats.org/drawingml/2006/wordprocessingDrawing" xmlns:wpg="http://schemas.microsoft.com/office/word/2010/wordprocessingGroup" xmlns:wpi="http://schemas.microsoft.com/office/word/2010/wordprocessingInk" xmlns:wps="http://schemas.microsoft.com/office/word/2010/wordprocessingShape" xmlns:o="urn:schemas-microsoft-com:office:office" xmlns:v="urn:schemas-microsoft-com:vml" xmlns:w10="urn:schemas-microsoft-com:office:word" xmlns:w="http://schemas.openxmlformats.org/wordprocessingml/2006/main" xmlns:w14="http://schemas.microsoft.com/office/word/2010/wordml" xmlns:w15="http://schemas.microsoft.com/office/word/2012/wordml" xmlns:w16cex="http://schemas.microsoft.com/office/word/2018/wordml/cex" xmlns:w16cid="http://schemas.microsoft.com/office/word/2016/wordml/cid" xmlns:w16="http://schemas.microsoft.com/office/word/2018/wordml" xmlns:w16sdtdh="http://schemas.microsoft.com/office/word/2020/wordml/sdtdatahash" xmlns:w16sdtfl="http://schemas.microsoft.com/office/word/2024/wordml/sdtformatlock" xmlns:w16se="http://schemas.microsoft.com/office/word/2015/wordml/symex" xmlns:w16du="http://schemas.microsoft.com/office/word/2023/wordml/word16du" xmlns:wne="http://schemas.microsoft.com/office/word/2006/wordml" mc:Ignorable="w14 w15 w16se w16cid w16 w16cex w16sdtdh w16sdtfl w16du wp14">
   <w:endnote w:type="separator" w:id="-1">
     <w:p>
       <w:r>
@@ -6584,7 +6336,7 @@
 </file>
 
 <file path=word/footnotes.xml><?xml version="1.0" encoding="utf-8"?>
-<w:footnotes xmlns:wpc="http://schemas.microsoft.com/office/word/2010/wordprocessingCanvas" xmlns:cx="http://schemas.microsoft.com/office/drawing/2014/chartex" xmlns:cx1="http://schemas.microsoft.com/office/drawing/2015/9/8/chartex" xmlns:cx2="http://schemas.microsoft.com/office/drawing/2015/10/21/chartex" xmlns:cx3="http://schemas.microsoft.com/office/drawing/2016/5/9/chartex" xmlns:cx4="http://schemas.microsoft.com/office/drawing/2016/5/10/chartex" xmlns:cx5="http://schemas.microsoft.com/office/drawing/2016/5/11/chartex" xmlns:cx6="http://schemas.microsoft.com/office/drawing/2016/5/12/chartex" xmlns:cx7="http://schemas.microsoft.com/office/drawing/2016/5/13/chartex" xmlns:cx8="http://schemas.microsoft.com/office/drawing/2016/5/14/chartex" xmlns:mc="http://schemas.openxmlformats.org/markup-compatibility/2006" xmlns:aink="http://schemas.microsoft.com/office/drawing/2016/ink" xmlns:am3d="http://schemas.microsoft.com/office/drawing/2017/model3d" xmlns:o="urn:schemas-microsoft-com:office:office" xmlns:oel="http://schemas.microsoft.com/office/2019/extlst" xmlns:r="http://schemas.openxmlformats.org/officeDocument/2006/relationships" xmlns:m="http://schemas.openxmlformats.org/officeDocument/2006/math" xmlns:v="urn:schemas-microsoft-com:vml" xmlns:wp14="http://schemas.microsoft.com/office/word/2010/wordprocessingDrawing" xmlns:wp="http://schemas.openxmlformats.org/drawingml/2006/wordprocessingDrawing" xmlns:w10="urn:schemas-microsoft-com:office:word" xmlns:w="http://schemas.openxmlformats.org/wordprocessingml/2006/main" xmlns:w14="http://schemas.microsoft.com/office/word/2010/wordml" xmlns:w15="http://schemas.microsoft.com/office/word/2012/wordml" xmlns:w16cex="http://schemas.microsoft.com/office/word/2018/wordml/cex" xmlns:w16cid="http://schemas.microsoft.com/office/word/2016/wordml/cid" xmlns:w16="http://schemas.microsoft.com/office/word/2018/wordml" xmlns:w16du="http://schemas.microsoft.com/office/word/2023/wordml/word16du" xmlns:w16sdtdh="http://schemas.microsoft.com/office/word/2020/wordml/sdtdatahash" xmlns:w16sdtfl="http://schemas.microsoft.com/office/word/2024/wordml/sdtformatlock" xmlns:w16se="http://schemas.microsoft.com/office/word/2015/wordml/symex" xmlns:wpg="http://schemas.microsoft.com/office/word/2010/wordprocessingGroup" xmlns:wpi="http://schemas.microsoft.com/office/word/2010/wordprocessingInk" xmlns:wne="http://schemas.microsoft.com/office/word/2006/wordml" xmlns:wps="http://schemas.microsoft.com/office/word/2010/wordprocessingShape" mc:Ignorable="w14 w15 w16se w16cid w16 w16cex w16sdtdh w16sdtfl w16du wp14">
+<w:footnotes xmlns:wpc="http://schemas.microsoft.com/office/word/2010/wordprocessingCanvas" xmlns:cx="http://schemas.microsoft.com/office/drawing/2014/chartex" xmlns:cx1="http://schemas.microsoft.com/office/drawing/2015/9/8/chartex" xmlns:cx2="http://schemas.microsoft.com/office/drawing/2015/10/21/chartex" xmlns:cx3="http://schemas.microsoft.com/office/drawing/2016/5/9/chartex" xmlns:cx4="http://schemas.microsoft.com/office/drawing/2016/5/10/chartex" xmlns:cx5="http://schemas.microsoft.com/office/drawing/2016/5/11/chartex" xmlns:cx6="http://schemas.microsoft.com/office/drawing/2016/5/12/chartex" xmlns:cx7="http://schemas.microsoft.com/office/drawing/2016/5/13/chartex" xmlns:cx8="http://schemas.microsoft.com/office/drawing/2016/5/14/chartex" xmlns:mc="http://schemas.openxmlformats.org/markup-compatibility/2006" xmlns:m="http://schemas.openxmlformats.org/officeDocument/2006/math" xmlns:aink="http://schemas.microsoft.com/office/drawing/2016/ink" xmlns:am3d="http://schemas.microsoft.com/office/drawing/2017/model3d" xmlns:oel="http://schemas.microsoft.com/office/2019/extlst" xmlns:r="http://schemas.openxmlformats.org/officeDocument/2006/relationships" xmlns:wp14="http://schemas.microsoft.com/office/word/2010/wordprocessingDrawing" xmlns:wp="http://schemas.openxmlformats.org/drawingml/2006/wordprocessingDrawing" xmlns:wpg="http://schemas.microsoft.com/office/word/2010/wordprocessingGroup" xmlns:wpi="http://schemas.microsoft.com/office/word/2010/wordprocessingInk" xmlns:wps="http://schemas.microsoft.com/office/word/2010/wordprocessingShape" xmlns:o="urn:schemas-microsoft-com:office:office" xmlns:v="urn:schemas-microsoft-com:vml" xmlns:w10="urn:schemas-microsoft-com:office:word" xmlns:w="http://schemas.openxmlformats.org/wordprocessingml/2006/main" xmlns:w14="http://schemas.microsoft.com/office/word/2010/wordml" xmlns:w15="http://schemas.microsoft.com/office/word/2012/wordml" xmlns:w16cex="http://schemas.microsoft.com/office/word/2018/wordml/cex" xmlns:w16cid="http://schemas.microsoft.com/office/word/2016/wordml/cid" xmlns:w16="http://schemas.microsoft.com/office/word/2018/wordml" xmlns:w16sdtdh="http://schemas.microsoft.com/office/word/2020/wordml/sdtdatahash" xmlns:w16sdtfl="http://schemas.microsoft.com/office/word/2024/wordml/sdtformatlock" xmlns:w16se="http://schemas.microsoft.com/office/word/2015/wordml/symex" xmlns:w16du="http://schemas.microsoft.com/office/word/2023/wordml/word16du" xmlns:wne="http://schemas.microsoft.com/office/word/2006/wordml" mc:Ignorable="w14 w15 w16se w16cid w16 w16cex w16sdtdh w16sdtfl w16du wp14">
   <w:footnote w:type="separator" w:id="-1">
     <w:p>
       <w:r>
@@ -6603,7 +6355,7 @@
 </file>
 
 <file path=word/header1.xml><?xml version="1.0" encoding="utf-8"?>
-<w:hdr xmlns:wpc="http://schemas.microsoft.com/office/word/2010/wordprocessingCanvas" xmlns:cx="http://schemas.microsoft.com/office/drawing/2014/chartex" xmlns:cx1="http://schemas.microsoft.com/office/drawing/2015/9/8/chartex" xmlns:cx2="http://schemas.microsoft.com/office/drawing/2015/10/21/chartex" xmlns:cx3="http://schemas.microsoft.com/office/drawing/2016/5/9/chartex" xmlns:cx4="http://schemas.microsoft.com/office/drawing/2016/5/10/chartex" xmlns:cx5="http://schemas.microsoft.com/office/drawing/2016/5/11/chartex" xmlns:cx6="http://schemas.microsoft.com/office/drawing/2016/5/12/chartex" xmlns:cx7="http://schemas.microsoft.com/office/drawing/2016/5/13/chartex" xmlns:cx8="http://schemas.microsoft.com/office/drawing/2016/5/14/chartex" xmlns:mc="http://schemas.openxmlformats.org/markup-compatibility/2006" xmlns:aink="http://schemas.microsoft.com/office/drawing/2016/ink" xmlns:am3d="http://schemas.microsoft.com/office/drawing/2017/model3d" xmlns:o="urn:schemas-microsoft-com:office:office" xmlns:oel="http://schemas.microsoft.com/office/2019/extlst" xmlns:r="http://schemas.openxmlformats.org/officeDocument/2006/relationships" xmlns:m="http://schemas.openxmlformats.org/officeDocument/2006/math" xmlns:v="urn:schemas-microsoft-com:vml" xmlns:wp14="http://schemas.microsoft.com/office/word/2010/wordprocessingDrawing" xmlns:wp="http://schemas.openxmlformats.org/drawingml/2006/wordprocessingDrawing" xmlns:w10="urn:schemas-microsoft-com:office:word" xmlns:w="http://schemas.openxmlformats.org/wordprocessingml/2006/main" xmlns:w14="http://schemas.microsoft.com/office/word/2010/wordml" xmlns:w15="http://schemas.microsoft.com/office/word/2012/wordml" xmlns:w16cex="http://schemas.microsoft.com/office/word/2018/wordml/cex" xmlns:w16cid="http://schemas.microsoft.com/office/word/2016/wordml/cid" xmlns:w16="http://schemas.microsoft.com/office/word/2018/wordml" xmlns:w16du="http://schemas.microsoft.com/office/word/2023/wordml/word16du" xmlns:w16sdtdh="http://schemas.microsoft.com/office/word/2020/wordml/sdtdatahash" xmlns:w16sdtfl="http://schemas.microsoft.com/office/word/2024/wordml/sdtformatlock" xmlns:w16se="http://schemas.microsoft.com/office/word/2015/wordml/symex" xmlns:wpg="http://schemas.microsoft.com/office/word/2010/wordprocessingGroup" xmlns:wpi="http://schemas.microsoft.com/office/word/2010/wordprocessingInk" xmlns:wne="http://schemas.microsoft.com/office/word/2006/wordml" xmlns:wps="http://schemas.microsoft.com/office/word/2010/wordprocessingShape" mc:Ignorable="w14 w15 w16se w16cid w16 w16cex w16sdtdh w16sdtfl w16du wp14">
+<w:hdr xmlns:wpc="http://schemas.microsoft.com/office/word/2010/wordprocessingCanvas" xmlns:cx="http://schemas.microsoft.com/office/drawing/2014/chartex" xmlns:cx1="http://schemas.microsoft.com/office/drawing/2015/9/8/chartex" xmlns:cx2="http://schemas.microsoft.com/office/drawing/2015/10/21/chartex" xmlns:cx3="http://schemas.microsoft.com/office/drawing/2016/5/9/chartex" xmlns:cx4="http://schemas.microsoft.com/office/drawing/2016/5/10/chartex" xmlns:cx5="http://schemas.microsoft.com/office/drawing/2016/5/11/chartex" xmlns:cx6="http://schemas.microsoft.com/office/drawing/2016/5/12/chartex" xmlns:cx7="http://schemas.microsoft.com/office/drawing/2016/5/13/chartex" xmlns:cx8="http://schemas.microsoft.com/office/drawing/2016/5/14/chartex" xmlns:mc="http://schemas.openxmlformats.org/markup-compatibility/2006" xmlns:m="http://schemas.openxmlformats.org/officeDocument/2006/math" xmlns:aink="http://schemas.microsoft.com/office/drawing/2016/ink" xmlns:am3d="http://schemas.microsoft.com/office/drawing/2017/model3d" xmlns:oel="http://schemas.microsoft.com/office/2019/extlst" xmlns:r="http://schemas.openxmlformats.org/officeDocument/2006/relationships" xmlns:wp14="http://schemas.microsoft.com/office/word/2010/wordprocessingDrawing" xmlns:wp="http://schemas.openxmlformats.org/drawingml/2006/wordprocessingDrawing" xmlns:wpg="http://schemas.microsoft.com/office/word/2010/wordprocessingGroup" xmlns:wpi="http://schemas.microsoft.com/office/word/2010/wordprocessingInk" xmlns:wps="http://schemas.microsoft.com/office/word/2010/wordprocessingShape" xmlns:o="urn:schemas-microsoft-com:office:office" xmlns:v="urn:schemas-microsoft-com:vml" xmlns:w10="urn:schemas-microsoft-com:office:word" xmlns:w="http://schemas.openxmlformats.org/wordprocessingml/2006/main" xmlns:w14="http://schemas.microsoft.com/office/word/2010/wordml" xmlns:w15="http://schemas.microsoft.com/office/word/2012/wordml" xmlns:w16cex="http://schemas.microsoft.com/office/word/2018/wordml/cex" xmlns:w16cid="http://schemas.microsoft.com/office/word/2016/wordml/cid" xmlns:w16="http://schemas.microsoft.com/office/word/2018/wordml" xmlns:w16sdtdh="http://schemas.microsoft.com/office/word/2020/wordml/sdtdatahash" xmlns:w16sdtfl="http://schemas.microsoft.com/office/word/2024/wordml/sdtformatlock" xmlns:w16se="http://schemas.microsoft.com/office/word/2015/wordml/symex" xmlns:w16du="http://schemas.microsoft.com/office/word/2023/wordml/word16du" xmlns:wne="http://schemas.microsoft.com/office/word/2006/wordml" mc:Ignorable="w14 w15 w16se w16cid w16 w16cex w16sdtdh w16sdtfl w16du wp14">
   <w:p>
     <w:r>
       <w:rPr>
@@ -6716,7 +6468,7 @@
 </file>
 
 <file path=word/header2.xml><?xml version="1.0" encoding="utf-8"?>
-<w:hdr xmlns:wpc="http://schemas.microsoft.com/office/word/2010/wordprocessingCanvas" xmlns:cx="http://schemas.microsoft.com/office/drawing/2014/chartex" xmlns:cx1="http://schemas.microsoft.com/office/drawing/2015/9/8/chartex" xmlns:cx2="http://schemas.microsoft.com/office/drawing/2015/10/21/chartex" xmlns:cx3="http://schemas.microsoft.com/office/drawing/2016/5/9/chartex" xmlns:cx4="http://schemas.microsoft.com/office/drawing/2016/5/10/chartex" xmlns:cx5="http://schemas.microsoft.com/office/drawing/2016/5/11/chartex" xmlns:cx6="http://schemas.microsoft.com/office/drawing/2016/5/12/chartex" xmlns:cx7="http://schemas.microsoft.com/office/drawing/2016/5/13/chartex" xmlns:cx8="http://schemas.microsoft.com/office/drawing/2016/5/14/chartex" xmlns:mc="http://schemas.openxmlformats.org/markup-compatibility/2006" xmlns:aink="http://schemas.microsoft.com/office/drawing/2016/ink" xmlns:am3d="http://schemas.microsoft.com/office/drawing/2017/model3d" xmlns:o="urn:schemas-microsoft-com:office:office" xmlns:oel="http://schemas.microsoft.com/office/2019/extlst" xmlns:r="http://schemas.openxmlformats.org/officeDocument/2006/relationships" xmlns:m="http://schemas.openxmlformats.org/officeDocument/2006/math" xmlns:v="urn:schemas-microsoft-com:vml" xmlns:wp14="http://schemas.microsoft.com/office/word/2010/wordprocessingDrawing" xmlns:wp="http://schemas.openxmlformats.org/drawingml/2006/wordprocessingDrawing" xmlns:w10="urn:schemas-microsoft-com:office:word" xmlns:w="http://schemas.openxmlformats.org/wordprocessingml/2006/main" xmlns:w14="http://schemas.microsoft.com/office/word/2010/wordml" xmlns:w15="http://schemas.microsoft.com/office/word/2012/wordml" xmlns:w16cex="http://schemas.microsoft.com/office/word/2018/wordml/cex" xmlns:w16cid="http://schemas.microsoft.com/office/word/2016/wordml/cid" xmlns:w16="http://schemas.microsoft.com/office/word/2018/wordml" xmlns:w16du="http://schemas.microsoft.com/office/word/2023/wordml/word16du" xmlns:w16sdtdh="http://schemas.microsoft.com/office/word/2020/wordml/sdtdatahash" xmlns:w16sdtfl="http://schemas.microsoft.com/office/word/2024/wordml/sdtformatlock" xmlns:w16se="http://schemas.microsoft.com/office/word/2015/wordml/symex" xmlns:wpg="http://schemas.microsoft.com/office/word/2010/wordprocessingGroup" xmlns:wpi="http://schemas.microsoft.com/office/word/2010/wordprocessingInk" xmlns:wne="http://schemas.microsoft.com/office/word/2006/wordml" xmlns:wps="http://schemas.microsoft.com/office/word/2010/wordprocessingShape" mc:Ignorable="w14 w15 w16se w16cid w16 w16cex w16sdtdh w16sdtfl w16du wp14">
+<w:hdr xmlns:wpc="http://schemas.microsoft.com/office/word/2010/wordprocessingCanvas" xmlns:cx="http://schemas.microsoft.com/office/drawing/2014/chartex" xmlns:cx1="http://schemas.microsoft.com/office/drawing/2015/9/8/chartex" xmlns:cx2="http://schemas.microsoft.com/office/drawing/2015/10/21/chartex" xmlns:cx3="http://schemas.microsoft.com/office/drawing/2016/5/9/chartex" xmlns:cx4="http://schemas.microsoft.com/office/drawing/2016/5/10/chartex" xmlns:cx5="http://schemas.microsoft.com/office/drawing/2016/5/11/chartex" xmlns:cx6="http://schemas.microsoft.com/office/drawing/2016/5/12/chartex" xmlns:cx7="http://schemas.microsoft.com/office/drawing/2016/5/13/chartex" xmlns:cx8="http://schemas.microsoft.com/office/drawing/2016/5/14/chartex" xmlns:mc="http://schemas.openxmlformats.org/markup-compatibility/2006" xmlns:m="http://schemas.openxmlformats.org/officeDocument/2006/math" xmlns:aink="http://schemas.microsoft.com/office/drawing/2016/ink" xmlns:am3d="http://schemas.microsoft.com/office/drawing/2017/model3d" xmlns:oel="http://schemas.microsoft.com/office/2019/extlst" xmlns:r="http://schemas.openxmlformats.org/officeDocument/2006/relationships" xmlns:wp14="http://schemas.microsoft.com/office/word/2010/wordprocessingDrawing" xmlns:wp="http://schemas.openxmlformats.org/drawingml/2006/wordprocessingDrawing" xmlns:wpg="http://schemas.microsoft.com/office/word/2010/wordprocessingGroup" xmlns:wpi="http://schemas.microsoft.com/office/word/2010/wordprocessingInk" xmlns:wps="http://schemas.microsoft.com/office/word/2010/wordprocessingShape" xmlns:o="urn:schemas-microsoft-com:office:office" xmlns:v="urn:schemas-microsoft-com:vml" xmlns:w10="urn:schemas-microsoft-com:office:word" xmlns:w="http://schemas.openxmlformats.org/wordprocessingml/2006/main" xmlns:w14="http://schemas.microsoft.com/office/word/2010/wordml" xmlns:w15="http://schemas.microsoft.com/office/word/2012/wordml" xmlns:w16cex="http://schemas.microsoft.com/office/word/2018/wordml/cex" xmlns:w16cid="http://schemas.microsoft.com/office/word/2016/wordml/cid" xmlns:w16="http://schemas.microsoft.com/office/word/2018/wordml" xmlns:w16sdtdh="http://schemas.microsoft.com/office/word/2020/wordml/sdtdatahash" xmlns:w16sdtfl="http://schemas.microsoft.com/office/word/2024/wordml/sdtformatlock" xmlns:w16se="http://schemas.microsoft.com/office/word/2015/wordml/symex" xmlns:w16du="http://schemas.microsoft.com/office/word/2023/wordml/word16du" xmlns:wne="http://schemas.microsoft.com/office/word/2006/wordml" mc:Ignorable="w14 w15 w16se w16cid w16 w16cex w16sdtdh w16sdtfl w16du wp14">
   <w:tbl>
     <w:tblPr>
       <w:tblStyle w:val="TableGrid"/>
@@ -6832,7 +6584,7 @@
 </file>
 
 <file path=word/header3.xml><?xml version="1.0" encoding="utf-8"?>
-<w:hdr xmlns:wpc="http://schemas.microsoft.com/office/word/2010/wordprocessingCanvas" xmlns:cx="http://schemas.microsoft.com/office/drawing/2014/chartex" xmlns:cx1="http://schemas.microsoft.com/office/drawing/2015/9/8/chartex" xmlns:cx2="http://schemas.microsoft.com/office/drawing/2015/10/21/chartex" xmlns:cx3="http://schemas.microsoft.com/office/drawing/2016/5/9/chartex" xmlns:cx4="http://schemas.microsoft.com/office/drawing/2016/5/10/chartex" xmlns:cx5="http://schemas.microsoft.com/office/drawing/2016/5/11/chartex" xmlns:cx6="http://schemas.microsoft.com/office/drawing/2016/5/12/chartex" xmlns:cx7="http://schemas.microsoft.com/office/drawing/2016/5/13/chartex" xmlns:cx8="http://schemas.microsoft.com/office/drawing/2016/5/14/chartex" xmlns:mc="http://schemas.openxmlformats.org/markup-compatibility/2006" xmlns:aink="http://schemas.microsoft.com/office/drawing/2016/ink" xmlns:am3d="http://schemas.microsoft.com/office/drawing/2017/model3d" xmlns:o="urn:schemas-microsoft-com:office:office" xmlns:oel="http://schemas.microsoft.com/office/2019/extlst" xmlns:r="http://schemas.openxmlformats.org/officeDocument/2006/relationships" xmlns:m="http://schemas.openxmlformats.org/officeDocument/2006/math" xmlns:v="urn:schemas-microsoft-com:vml" xmlns:wp14="http://schemas.microsoft.com/office/word/2010/wordprocessingDrawing" xmlns:wp="http://schemas.openxmlformats.org/drawingml/2006/wordprocessingDrawing" xmlns:w10="urn:schemas-microsoft-com:office:word" xmlns:w="http://schemas.openxmlformats.org/wordprocessingml/2006/main" xmlns:w14="http://schemas.microsoft.com/office/word/2010/wordml" xmlns:w15="http://schemas.microsoft.com/office/word/2012/wordml" xmlns:w16cex="http://schemas.microsoft.com/office/word/2018/wordml/cex" xmlns:w16cid="http://schemas.microsoft.com/office/word/2016/wordml/cid" xmlns:w16="http://schemas.microsoft.com/office/word/2018/wordml" xmlns:w16du="http://schemas.microsoft.com/office/word/2023/wordml/word16du" xmlns:w16sdtdh="http://schemas.microsoft.com/office/word/2020/wordml/sdtdatahash" xmlns:w16sdtfl="http://schemas.microsoft.com/office/word/2024/wordml/sdtformatlock" xmlns:w16se="http://schemas.microsoft.com/office/word/2015/wordml/symex" xmlns:wpg="http://schemas.microsoft.com/office/word/2010/wordprocessingGroup" xmlns:wpi="http://schemas.microsoft.com/office/word/2010/wordprocessingInk" xmlns:wne="http://schemas.microsoft.com/office/word/2006/wordml" xmlns:wps="http://schemas.microsoft.com/office/word/2010/wordprocessingShape" mc:Ignorable="w14 w15 w16se w16cid w16 w16cex w16sdtdh w16sdtfl w16du wp14">
+<w:hdr xmlns:wpc="http://schemas.microsoft.com/office/word/2010/wordprocessingCanvas" xmlns:cx="http://schemas.microsoft.com/office/drawing/2014/chartex" xmlns:cx1="http://schemas.microsoft.com/office/drawing/2015/9/8/chartex" xmlns:cx2="http://schemas.microsoft.com/office/drawing/2015/10/21/chartex" xmlns:cx3="http://schemas.microsoft.com/office/drawing/2016/5/9/chartex" xmlns:cx4="http://schemas.microsoft.com/office/drawing/2016/5/10/chartex" xmlns:cx5="http://schemas.microsoft.com/office/drawing/2016/5/11/chartex" xmlns:cx6="http://schemas.microsoft.com/office/drawing/2016/5/12/chartex" xmlns:cx7="http://schemas.microsoft.com/office/drawing/2016/5/13/chartex" xmlns:cx8="http://schemas.microsoft.com/office/drawing/2016/5/14/chartex" xmlns:mc="http://schemas.openxmlformats.org/markup-compatibility/2006" xmlns:m="http://schemas.openxmlformats.org/officeDocument/2006/math" xmlns:aink="http://schemas.microsoft.com/office/drawing/2016/ink" xmlns:am3d="http://schemas.microsoft.com/office/drawing/2017/model3d" xmlns:oel="http://schemas.microsoft.com/office/2019/extlst" xmlns:r="http://schemas.openxmlformats.org/officeDocument/2006/relationships" xmlns:wp14="http://schemas.microsoft.com/office/word/2010/wordprocessingDrawing" xmlns:wp="http://schemas.openxmlformats.org/drawingml/2006/wordprocessingDrawing" xmlns:wpg="http://schemas.microsoft.com/office/word/2010/wordprocessingGroup" xmlns:wpi="http://schemas.microsoft.com/office/word/2010/wordprocessingInk" xmlns:wps="http://schemas.microsoft.com/office/word/2010/wordprocessingShape" xmlns:o="urn:schemas-microsoft-com:office:office" xmlns:v="urn:schemas-microsoft-com:vml" xmlns:w10="urn:schemas-microsoft-com:office:word" xmlns:w="http://schemas.openxmlformats.org/wordprocessingml/2006/main" xmlns:w14="http://schemas.microsoft.com/office/word/2010/wordml" xmlns:w15="http://schemas.microsoft.com/office/word/2012/wordml" xmlns:w16cex="http://schemas.microsoft.com/office/word/2018/wordml/cex" xmlns:w16cid="http://schemas.microsoft.com/office/word/2016/wordml/cid" xmlns:w16="http://schemas.microsoft.com/office/word/2018/wordml" xmlns:w16sdtdh="http://schemas.microsoft.com/office/word/2020/wordml/sdtdatahash" xmlns:w16sdtfl="http://schemas.microsoft.com/office/word/2024/wordml/sdtformatlock" xmlns:w16se="http://schemas.microsoft.com/office/word/2015/wordml/symex" xmlns:w16du="http://schemas.microsoft.com/office/word/2023/wordml/word16du" xmlns:wne="http://schemas.microsoft.com/office/word/2006/wordml" mc:Ignorable="w14 w15 w16se w16cid w16 w16cex w16sdtdh w16sdtfl w16du wp14">
   <w:tbl>
     <w:tblPr>
       <w:tblStyle w:val="TableGrid"/>
@@ -6948,7 +6700,7 @@
 </file>
 
 <file path=word/numbering.xml><?xml version="1.0" encoding="utf-8"?>
-<w:numbering xmlns:wpc="http://schemas.microsoft.com/office/word/2010/wordprocessingCanvas" xmlns:cx="http://schemas.microsoft.com/office/drawing/2014/chartex" xmlns:cx1="http://schemas.microsoft.com/office/drawing/2015/9/8/chartex" xmlns:cx2="http://schemas.microsoft.com/office/drawing/2015/10/21/chartex" xmlns:cx3="http://schemas.microsoft.com/office/drawing/2016/5/9/chartex" xmlns:cx4="http://schemas.microsoft.com/office/drawing/2016/5/10/chartex" xmlns:cx5="http://schemas.microsoft.com/office/drawing/2016/5/11/chartex" xmlns:cx6="http://schemas.microsoft.com/office/drawing/2016/5/12/chartex" xmlns:cx7="http://schemas.microsoft.com/office/drawing/2016/5/13/chartex" xmlns:cx8="http://schemas.microsoft.com/office/drawing/2016/5/14/chartex" xmlns:mc="http://schemas.openxmlformats.org/markup-compatibility/2006" xmlns:aink="http://schemas.microsoft.com/office/drawing/2016/ink" xmlns:am3d="http://schemas.microsoft.com/office/drawing/2017/model3d" xmlns:o="urn:schemas-microsoft-com:office:office" xmlns:oel="http://schemas.microsoft.com/office/2019/extlst" xmlns:r="http://schemas.openxmlformats.org/officeDocument/2006/relationships" xmlns:m="http://schemas.openxmlformats.org/officeDocument/2006/math" xmlns:v="urn:schemas-microsoft-com:vml" xmlns:wp14="http://schemas.microsoft.com/office/word/2010/wordprocessingDrawing" xmlns:wp="http://schemas.openxmlformats.org/drawingml/2006/wordprocessingDrawing" xmlns:w10="urn:schemas-microsoft-com:office:word" xmlns:w="http://schemas.openxmlformats.org/wordprocessingml/2006/main" xmlns:w14="http://schemas.microsoft.com/office/word/2010/wordml" xmlns:w15="http://schemas.microsoft.com/office/word/2012/wordml" xmlns:w16cex="http://schemas.microsoft.com/office/word/2018/wordml/cex" xmlns:w16cid="http://schemas.microsoft.com/office/word/2016/wordml/cid" xmlns:w16="http://schemas.microsoft.com/office/word/2018/wordml" xmlns:w16du="http://schemas.microsoft.com/office/word/2023/wordml/word16du" xmlns:w16sdtdh="http://schemas.microsoft.com/office/word/2020/wordml/sdtdatahash" xmlns:w16sdtfl="http://schemas.microsoft.com/office/word/2024/wordml/sdtformatlock" xmlns:w16se="http://schemas.microsoft.com/office/word/2015/wordml/symex" xmlns:wpg="http://schemas.microsoft.com/office/word/2010/wordprocessingGroup" xmlns:wpi="http://schemas.microsoft.com/office/word/2010/wordprocessingInk" xmlns:wne="http://schemas.microsoft.com/office/word/2006/wordml" xmlns:wps="http://schemas.microsoft.com/office/word/2010/wordprocessingShape" mc:Ignorable="w14 w15 w16se w16cid w16 w16cex w16sdtdh w16sdtfl w16du wp14">
+<w:numbering xmlns:wpc="http://schemas.microsoft.com/office/word/2010/wordprocessingCanvas" xmlns:cx="http://schemas.microsoft.com/office/drawing/2014/chartex" xmlns:cx1="http://schemas.microsoft.com/office/drawing/2015/9/8/chartex" xmlns:cx2="http://schemas.microsoft.com/office/drawing/2015/10/21/chartex" xmlns:cx3="http://schemas.microsoft.com/office/drawing/2016/5/9/chartex" xmlns:cx4="http://schemas.microsoft.com/office/drawing/2016/5/10/chartex" xmlns:cx5="http://schemas.microsoft.com/office/drawing/2016/5/11/chartex" xmlns:cx6="http://schemas.microsoft.com/office/drawing/2016/5/12/chartex" xmlns:cx7="http://schemas.microsoft.com/office/drawing/2016/5/13/chartex" xmlns:cx8="http://schemas.microsoft.com/office/drawing/2016/5/14/chartex" xmlns:mc="http://schemas.openxmlformats.org/markup-compatibility/2006" xmlns:m="http://schemas.openxmlformats.org/officeDocument/2006/math" xmlns:aink="http://schemas.microsoft.com/office/drawing/2016/ink" xmlns:am3d="http://schemas.microsoft.com/office/drawing/2017/model3d" xmlns:oel="http://schemas.microsoft.com/office/2019/extlst" xmlns:r="http://schemas.openxmlformats.org/officeDocument/2006/relationships" xmlns:wp14="http://schemas.microsoft.com/office/word/2010/wordprocessingDrawing" xmlns:wp="http://schemas.openxmlformats.org/drawingml/2006/wordprocessingDrawing" xmlns:wpg="http://schemas.microsoft.com/office/word/2010/wordprocessingGroup" xmlns:wpi="http://schemas.microsoft.com/office/word/2010/wordprocessingInk" xmlns:wps="http://schemas.microsoft.com/office/word/2010/wordprocessingShape" xmlns:o="urn:schemas-microsoft-com:office:office" xmlns:v="urn:schemas-microsoft-com:vml" xmlns:w10="urn:schemas-microsoft-com:office:word" xmlns:w="http://schemas.openxmlformats.org/wordprocessingml/2006/main" xmlns:w14="http://schemas.microsoft.com/office/word/2010/wordml" xmlns:w15="http://schemas.microsoft.com/office/word/2012/wordml" xmlns:w16cex="http://schemas.microsoft.com/office/word/2018/wordml/cex" xmlns:w16cid="http://schemas.microsoft.com/office/word/2016/wordml/cid" xmlns:w16="http://schemas.microsoft.com/office/word/2018/wordml" xmlns:w16sdtdh="http://schemas.microsoft.com/office/word/2020/wordml/sdtdatahash" xmlns:w16sdtfl="http://schemas.microsoft.com/office/word/2024/wordml/sdtformatlock" xmlns:w16se="http://schemas.microsoft.com/office/word/2015/wordml/symex" xmlns:w16du="http://schemas.microsoft.com/office/word/2023/wordml/word16du" xmlns:wne="http://schemas.microsoft.com/office/word/2006/wordml" mc:Ignorable="w14 w15 w16se w16cid w16 w16cex w16sdtdh w16sdtfl w16du wp14">
   <w:abstractNum w:abstractNumId="0" w15:restartNumberingAfterBreak="0">
     <w:nsid w:val="00000001"/>
     <w:multiLevelType w:val="hybridMultilevel"/>
@@ -9980,7 +9732,7 @@
 </file>
 
 <file path=word/styles.xml><?xml version="1.0" encoding="utf-8"?>
-<w:styles xmlns:mc="http://schemas.openxmlformats.org/markup-compatibility/2006" xmlns:r="http://schemas.openxmlformats.org/officeDocument/2006/relationships" xmlns:w="http://schemas.openxmlformats.org/wordprocessingml/2006/main" xmlns:w14="http://schemas.microsoft.com/office/word/2010/wordml" xmlns:w15="http://schemas.microsoft.com/office/word/2012/wordml" xmlns:w16cex="http://schemas.microsoft.com/office/word/2018/wordml/cex" xmlns:w16cid="http://schemas.microsoft.com/office/word/2016/wordml/cid" xmlns:w16="http://schemas.microsoft.com/office/word/2018/wordml" xmlns:w16du="http://schemas.microsoft.com/office/word/2023/wordml/word16du" xmlns:w16sdtdh="http://schemas.microsoft.com/office/word/2020/wordml/sdtdatahash" xmlns:w16sdtfl="http://schemas.microsoft.com/office/word/2024/wordml/sdtformatlock" xmlns:w16se="http://schemas.microsoft.com/office/word/2015/wordml/symex" mc:Ignorable="w14 w15 w16se w16cid w16 w16cex w16sdtdh w16sdtfl w16du">
+<w:styles xmlns:mc="http://schemas.openxmlformats.org/markup-compatibility/2006" xmlns:r="http://schemas.openxmlformats.org/officeDocument/2006/relationships" xmlns:w="http://schemas.openxmlformats.org/wordprocessingml/2006/main" xmlns:w14="http://schemas.microsoft.com/office/word/2010/wordml" xmlns:w15="http://schemas.microsoft.com/office/word/2012/wordml" xmlns:w16cex="http://schemas.microsoft.com/office/word/2018/wordml/cex" xmlns:w16cid="http://schemas.microsoft.com/office/word/2016/wordml/cid" xmlns:w16="http://schemas.microsoft.com/office/word/2018/wordml" xmlns:w16sdtdh="http://schemas.microsoft.com/office/word/2020/wordml/sdtdatahash" xmlns:w16sdtfl="http://schemas.microsoft.com/office/word/2024/wordml/sdtformatlock" xmlns:w16se="http://schemas.microsoft.com/office/word/2015/wordml/symex" xmlns:w16du="http://schemas.microsoft.com/office/word/2023/wordml/word16du" mc:Ignorable="w14 w15 w16se w16cid w16 w16cex w16sdtdh w16sdtfl w16du">
   <w:docDefaults>
     <w:rPrDefault>
       <w:rPr>

</xml_diff>

<commit_message>
added neon blog and fixed posters
</commit_message>
<xml_diff>
--- a/pdf/DanielleBlumsteinCV.docx
+++ b/pdf/DanielleBlumsteinCV.docx
@@ -2147,15 +2147,118 @@
           <w:bCs/>
         </w:rPr>
       </w:pPr>
-    </w:p>
-    <w:p>
-      <w:pPr>
-        <w:ind w:left="270" w:right="90" w:hanging="270"/>
+      <w:r>
         <w:rPr>
           <w:b/>
           <w:bCs/>
         </w:rPr>
-      </w:pPr>
+        <w:t>WORKSHOPS AND SPECIAL COURSES</w:t>
+      </w:r>
+    </w:p>
+    <w:p>
+      <w:pPr>
+        <w:ind w:left="360" w:right="90" w:hanging="360"/>
+        <w:rPr>
+          <w:rFonts w:ascii="TimesNewRomanPSMT" w:hAnsi="TimesNewRomanPSMT"/>
+        </w:rPr>
+      </w:pPr>
+      <w:r>
+        <w:rPr>
+          <w:rFonts w:ascii="TimesNewRomanPSMT" w:hAnsi="TimesNewRomanPSMT"/>
+        </w:rPr>
+        <w:t>2024 Hatfield Marine Science Center, Research Summit, Newport Oregon</w:t>
+      </w:r>
+    </w:p>
+    <w:p>
+      <w:pPr>
+        <w:ind w:left="360" w:right="90" w:hanging="360"/>
+        <w:rPr>
+          <w:rFonts w:ascii="TimesNewRomanPSMT" w:hAnsi="TimesNewRomanPSMT"/>
+        </w:rPr>
+      </w:pPr>
+      <w:r>
+        <w:rPr>
+          <w:rFonts w:ascii="TimesNewRomanPSMT" w:hAnsi="TimesNewRomanPSMT"/>
+        </w:rPr>
+        <w:lastRenderedPageBreak/>
+        <w:t>2021 RNA-Seq Concepts, Design &amp; Workflows. Common Fund Data Ecosystem, UC Davis</w:t>
+      </w:r>
+    </w:p>
+    <w:p>
+      <w:pPr>
+        <w:ind w:left="360" w:right="90" w:hanging="360"/>
+        <w:rPr>
+          <w:rFonts w:ascii="TimesNewRomanPSMT" w:hAnsi="TimesNewRomanPSMT"/>
+        </w:rPr>
+      </w:pPr>
+      <w:r>
+        <w:rPr>
+          <w:rFonts w:ascii="TimesNewRomanPSMT" w:hAnsi="TimesNewRomanPSMT"/>
+        </w:rPr>
+        <w:t xml:space="preserve">2018 NFS-funded expert workshop for the development of a global experiment to understand </w:t>
+      </w:r>
+      <w:proofErr w:type="spellStart"/>
+      <w:r>
+        <w:rPr>
+          <w:rFonts w:ascii="TimesNewRomanPSMT" w:hAnsi="TimesNewRomanPSMT"/>
+        </w:rPr>
+        <w:t>Coregonid</w:t>
+      </w:r>
+      <w:proofErr w:type="spellEnd"/>
+      <w:r>
+        <w:rPr>
+          <w:rFonts w:ascii="TimesNewRomanPSMT" w:hAnsi="TimesNewRomanPSMT"/>
+        </w:rPr>
+        <w:t xml:space="preserve"> adaptive response to changing thermal regimes. Thonon – les – Bains, Franc</w:t>
+      </w:r>
+      <w:r>
+        <w:rPr>
+          <w:rFonts w:ascii="TimesNewRomanPSMT" w:hAnsi="TimesNewRomanPSMT"/>
+        </w:rPr>
+        <w:t>e</w:t>
+      </w:r>
+    </w:p>
+    <w:p>
+      <w:pPr>
+        <w:ind w:left="360" w:right="90" w:hanging="360"/>
+        <w:rPr>
+          <w:rFonts w:ascii="TimesNewRomanPSMT" w:hAnsi="TimesNewRomanPSMT"/>
+        </w:rPr>
+      </w:pPr>
+      <w:r>
+        <w:rPr>
+          <w:rFonts w:ascii="TimesNewRomanPSMT" w:hAnsi="TimesNewRomanPSMT"/>
+        </w:rPr>
+        <w:t>2017 RAD Sequencing Workshop. Molecular Conservation Genetics Laboratory, University of Wisconsin – Stevens Point</w:t>
+      </w:r>
+    </w:p>
+    <w:p>
+      <w:pPr>
+        <w:ind w:left="360" w:right="90" w:hanging="360"/>
+        <w:rPr>
+          <w:rFonts w:ascii="TimesNewRomanPSMT" w:hAnsi="TimesNewRomanPSMT"/>
+        </w:rPr>
+      </w:pPr>
+      <w:r>
+        <w:rPr>
+          <w:rFonts w:ascii="TimesNewRomanPSMT" w:hAnsi="TimesNewRomanPSMT"/>
+        </w:rPr>
+        <w:t>2016 Microsatellite Genotyping Workshop. Molecular Ecology Laboratory, Michigan State University</w:t>
+      </w:r>
+    </w:p>
+    <w:p>
+      <w:pPr>
+        <w:ind w:left="360" w:right="90" w:hanging="360"/>
+        <w:rPr>
+          <w:rFonts w:ascii="TimesNewRomanPSMT" w:hAnsi="TimesNewRomanPSMT"/>
+        </w:rPr>
+      </w:pPr>
+      <w:r>
+        <w:rPr>
+          <w:rFonts w:ascii="TimesNewRomanPSMT" w:hAnsi="TimesNewRomanPSMT"/>
+        </w:rPr>
+        <w:t>2015 Ecology and Plant Systematics Field Courses. Kellogg Biological Station, Michigan. 2014. MDNR Fish Sampling Techniques Course. Gaylord, Michigan</w:t>
+      </w:r>
     </w:p>
     <w:p>
       <w:pPr>
@@ -2165,211 +2268,467 @@
           <w:bCs/>
         </w:rPr>
       </w:pPr>
-      <w:r>
+    </w:p>
+    <w:p>
+      <w:pPr>
+        <w:ind w:left="270" w:right="90" w:hanging="270"/>
         <w:rPr>
           <w:b/>
           <w:bCs/>
         </w:rPr>
-        <w:lastRenderedPageBreak/>
-        <w:t>WORKSHOPS AND SPECIAL COURSES</w:t>
-      </w:r>
-    </w:p>
-    <w:p>
-      <w:pPr>
-        <w:ind w:left="360" w:right="90" w:hanging="360"/>
-        <w:rPr>
-          <w:rFonts w:ascii="TimesNewRomanPSMT" w:hAnsi="TimesNewRomanPSMT"/>
-        </w:rPr>
-      </w:pPr>
-      <w:r>
-        <w:rPr>
-          <w:rFonts w:ascii="TimesNewRomanPSMT" w:hAnsi="TimesNewRomanPSMT"/>
-        </w:rPr>
-        <w:t>2024 Hatfield Marine Science Center, Research Summit, Newport Oregon</w:t>
-      </w:r>
-    </w:p>
-    <w:p>
-      <w:pPr>
-        <w:ind w:left="360" w:right="90" w:hanging="360"/>
-        <w:rPr>
-          <w:rFonts w:ascii="TimesNewRomanPSMT" w:hAnsi="TimesNewRomanPSMT"/>
-        </w:rPr>
-      </w:pPr>
-      <w:r>
-        <w:rPr>
-          <w:rFonts w:ascii="TimesNewRomanPSMT" w:hAnsi="TimesNewRomanPSMT"/>
-        </w:rPr>
-        <w:t>2021 RNA-Seq Concepts, Design &amp; Workflows. Common Fund Data Ecosystem, UC Davis</w:t>
-      </w:r>
-    </w:p>
-    <w:p>
-      <w:pPr>
-        <w:ind w:left="360" w:right="90" w:hanging="360"/>
-        <w:rPr>
-          <w:rFonts w:ascii="TimesNewRomanPSMT" w:hAnsi="TimesNewRomanPSMT"/>
-        </w:rPr>
-      </w:pPr>
-      <w:r>
-        <w:rPr>
-          <w:rFonts w:ascii="TimesNewRomanPSMT" w:hAnsi="TimesNewRomanPSMT"/>
-        </w:rPr>
-        <w:t xml:space="preserve">2018 NFS-funded expert workshop for the development of a global experiment to understand </w:t>
-      </w:r>
-      <w:proofErr w:type="spellStart"/>
-      <w:r>
-        <w:rPr>
-          <w:rFonts w:ascii="TimesNewRomanPSMT" w:hAnsi="TimesNewRomanPSMT"/>
-        </w:rPr>
-        <w:t>Coregonid</w:t>
-      </w:r>
-      <w:proofErr w:type="spellEnd"/>
-      <w:r>
-        <w:rPr>
-          <w:rFonts w:ascii="TimesNewRomanPSMT" w:hAnsi="TimesNewRomanPSMT"/>
-        </w:rPr>
-        <w:t xml:space="preserve"> adaptive response to changing thermal regimes. Thonon – les – Bains, Franc</w:t>
-      </w:r>
-      <w:r>
-        <w:rPr>
-          <w:rFonts w:ascii="TimesNewRomanPSMT" w:hAnsi="TimesNewRomanPSMT"/>
-        </w:rPr>
-        <w:t>e</w:t>
-      </w:r>
-    </w:p>
-    <w:p>
-      <w:pPr>
-        <w:ind w:left="360" w:right="90" w:hanging="360"/>
-        <w:rPr>
-          <w:rFonts w:ascii="TimesNewRomanPSMT" w:hAnsi="TimesNewRomanPSMT"/>
-        </w:rPr>
-      </w:pPr>
-      <w:r>
-        <w:rPr>
-          <w:rFonts w:ascii="TimesNewRomanPSMT" w:hAnsi="TimesNewRomanPSMT"/>
-        </w:rPr>
-        <w:t>2017 RAD Sequencing Workshop. Molecular Conservation Genetics Laboratory, University of Wisconsin – Stevens Point</w:t>
-      </w:r>
-    </w:p>
-    <w:p>
-      <w:pPr>
-        <w:ind w:left="360" w:right="90" w:hanging="360"/>
-        <w:rPr>
-          <w:rFonts w:ascii="TimesNewRomanPSMT" w:hAnsi="TimesNewRomanPSMT"/>
-        </w:rPr>
-      </w:pPr>
-      <w:r>
-        <w:rPr>
-          <w:rFonts w:ascii="TimesNewRomanPSMT" w:hAnsi="TimesNewRomanPSMT"/>
-        </w:rPr>
-        <w:t>2016 Microsatellite Genotyping Workshop. Molecular Ecology Laboratory, Michigan State University</w:t>
-      </w:r>
-    </w:p>
-    <w:p>
-      <w:pPr>
-        <w:ind w:left="360" w:right="90" w:hanging="360"/>
-        <w:rPr>
-          <w:rFonts w:ascii="TimesNewRomanPSMT" w:hAnsi="TimesNewRomanPSMT"/>
-        </w:rPr>
-      </w:pPr>
-      <w:r>
-        <w:rPr>
-          <w:rFonts w:ascii="TimesNewRomanPSMT" w:hAnsi="TimesNewRomanPSMT"/>
-        </w:rPr>
-        <w:t>2015 Ecology and Plant Systematics Field Courses. Kellogg Biological Station, Michigan. 2014. MDNR Fish Sampling Techniques Course. Gaylord, Michigan</w:t>
-      </w:r>
-    </w:p>
-    <w:p>
-      <w:pPr>
-        <w:ind w:left="270" w:right="90" w:hanging="270"/>
+      </w:pPr>
+      <w:r>
         <w:rPr>
           <w:b/>
           <w:bCs/>
         </w:rPr>
-      </w:pPr>
-    </w:p>
-    <w:p>
-      <w:pPr>
-        <w:ind w:left="270" w:right="90" w:hanging="270"/>
+        <w:t xml:space="preserve">PROFESSIONAL </w:t>
+      </w:r>
+      <w:r>
         <w:rPr>
           <w:b/>
           <w:bCs/>
         </w:rPr>
-      </w:pPr>
-      <w:r>
+        <w:t>MEMBERSHIPS</w:t>
+      </w:r>
+    </w:p>
+    <w:p>
+      <w:pPr>
+        <w:ind w:right="90"/>
+      </w:pPr>
+      <w:r>
+        <w:t>The Society for Integrative &amp; Comparative Biology 2021-</w:t>
+      </w:r>
+      <w:r>
+        <w:t>2023</w:t>
+      </w:r>
+    </w:p>
+    <w:p>
+      <w:pPr>
+        <w:ind w:right="90"/>
+      </w:pPr>
+      <w:r>
+        <w:t>American Society of Mammologists 2019–</w:t>
+      </w:r>
+      <w:r>
+        <w:t>2023</w:t>
+      </w:r>
+    </w:p>
+    <w:p>
+      <w:pPr>
+        <w:ind w:right="90"/>
+      </w:pPr>
+      <w:r>
+        <w:t>Society for the Study of Evolution 2019–</w:t>
+      </w:r>
+      <w:r>
+        <w:t>2023</w:t>
+      </w:r>
+    </w:p>
+    <w:p>
+      <w:pPr>
+        <w:ind w:right="90"/>
+      </w:pPr>
+      <w:r>
+        <w:t>UNH Advancing Women in Science 2019–</w:t>
+      </w:r>
+      <w:r>
+        <w:t>2020</w:t>
+      </w:r>
+    </w:p>
+    <w:p>
+      <w:pPr>
+        <w:ind w:right="90"/>
+      </w:pPr>
+      <w:r>
+        <w:t>American Fisheries Society 2017-2019</w:t>
+      </w:r>
+    </w:p>
+    <w:p>
+      <w:pPr>
+        <w:ind w:left="270" w:right="90" w:hanging="270"/>
         <w:rPr>
           <w:b/>
           <w:bCs/>
         </w:rPr>
-        <w:t xml:space="preserve">PROFESSIONAL </w:t>
-      </w:r>
-      <w:r>
+      </w:pPr>
+    </w:p>
+    <w:p>
+      <w:pPr>
+        <w:ind w:left="270" w:right="90" w:hanging="270"/>
         <w:rPr>
           <w:b/>
           <w:bCs/>
         </w:rPr>
-        <w:t>MEMBERSHIPS</w:t>
-      </w:r>
-    </w:p>
-    <w:p>
-      <w:pPr>
-        <w:ind w:right="90"/>
-      </w:pPr>
-      <w:r>
-        <w:t>The Society for Integrative &amp; Comparative Biology 2021-</w:t>
-      </w:r>
-      <w:r>
-        <w:t>2023</w:t>
-      </w:r>
-    </w:p>
-    <w:p>
-      <w:pPr>
-        <w:ind w:right="90"/>
-      </w:pPr>
-      <w:r>
-        <w:t>American Society of Mammologists 2019–</w:t>
-      </w:r>
-      <w:r>
-        <w:t>2023</w:t>
-      </w:r>
-    </w:p>
-    <w:p>
-      <w:pPr>
-        <w:ind w:right="90"/>
-      </w:pPr>
-      <w:r>
-        <w:t>Society for the Study of Evolution 2019–</w:t>
-      </w:r>
-      <w:r>
-        <w:t>2023</w:t>
-      </w:r>
-    </w:p>
-    <w:p>
-      <w:pPr>
-        <w:ind w:right="90"/>
-      </w:pPr>
-      <w:r>
-        <w:t>UNH Advancing Women in Science 2019–</w:t>
-      </w:r>
-      <w:r>
-        <w:t>2020</w:t>
-      </w:r>
-    </w:p>
-    <w:p>
-      <w:pPr>
-        <w:ind w:right="90"/>
-      </w:pPr>
-      <w:r>
-        <w:t>American Fisheries Society 2017-2019</w:t>
-      </w:r>
-    </w:p>
-    <w:p>
-      <w:pPr>
-        <w:ind w:left="270" w:right="90" w:hanging="270"/>
+      </w:pPr>
+      <w:r>
         <w:rPr>
           <w:b/>
           <w:bCs/>
         </w:rPr>
-      </w:pPr>
+        <w:t>PROFESSIONAL SERVICE</w:t>
+      </w:r>
+    </w:p>
+    <w:p>
+      <w:pPr>
+        <w:ind w:left="360" w:right="90" w:hanging="360"/>
+        <w:rPr>
+          <w:rFonts w:ascii="TimesNewRomanPSMT" w:hAnsi="TimesNewRomanPSMT"/>
+        </w:rPr>
+      </w:pPr>
+      <w:r>
+        <w:rPr>
+          <w:rFonts w:ascii="TimesNewRomanPSMT" w:hAnsi="TimesNewRomanPSMT"/>
+        </w:rPr>
+        <w:t xml:space="preserve">Ad hoc reviewer: </w:t>
+      </w:r>
+      <w:r>
+        <w:rPr>
+          <w:rFonts w:ascii="TimesNewRomanPSMT" w:hAnsi="TimesNewRomanPSMT"/>
+        </w:rPr>
+        <w:t xml:space="preserve">Ecological and Evolutionary Physiology (1), </w:t>
+      </w:r>
+      <w:r>
+        <w:rPr>
+          <w:rFonts w:ascii="TimesNewRomanPSMT" w:hAnsi="TimesNewRomanPSMT"/>
+        </w:rPr>
+        <w:t>Molecular Ecology (2), Transactions of the American Fisheries Society (1)</w:t>
+      </w:r>
+    </w:p>
+    <w:p>
+      <w:pPr>
+        <w:ind w:left="360" w:right="90" w:hanging="360"/>
+        <w:rPr>
+          <w:bCs/>
+          <w:iCs/>
+        </w:rPr>
+      </w:pPr>
+      <w:r>
+        <w:rPr>
+          <w:bCs/>
+          <w:iCs/>
+        </w:rPr>
+        <w:t>2023-2024 Elected COLSA Senator, Grad Student Senate, University of New Hampshire</w:t>
+      </w:r>
+    </w:p>
+    <w:p>
+      <w:pPr>
+        <w:ind w:left="360" w:right="90" w:hanging="360"/>
+        <w:rPr>
+          <w:rFonts w:ascii="TimesNewRomanPSMT" w:hAnsi="TimesNewRomanPSMT"/>
+        </w:rPr>
+      </w:pPr>
+      <w:r>
+        <w:rPr>
+          <w:bCs/>
+          <w:iCs/>
+        </w:rPr>
+        <w:t>2023 Invited Presenter, Seacoast Sips of Science, University of New Hampshire</w:t>
+      </w:r>
+    </w:p>
+    <w:p>
+      <w:pPr>
+        <w:ind w:left="360" w:right="90" w:hanging="360"/>
+        <w:rPr>
+          <w:bCs/>
+          <w:iCs/>
+        </w:rPr>
+      </w:pPr>
+      <w:r>
+        <w:rPr>
+          <w:rFonts w:ascii="TimesNewRomanPSMT" w:hAnsi="TimesNewRomanPSMT"/>
+        </w:rPr>
+        <w:t xml:space="preserve">2023 Session Chair, </w:t>
+      </w:r>
+      <w:r>
+        <w:rPr>
+          <w:bCs/>
+          <w:iCs/>
+        </w:rPr>
+        <w:t>13th International Mammalogical Congress</w:t>
+      </w:r>
+      <w:r>
+        <w:t xml:space="preserve">. </w:t>
+      </w:r>
+      <w:r>
+        <w:rPr>
+          <w:bCs/>
+          <w:iCs/>
+        </w:rPr>
+        <w:t>Anchorage, Alaska</w:t>
+      </w:r>
+    </w:p>
+    <w:p>
+      <w:pPr>
+        <w:ind w:left="360" w:right="90" w:hanging="360"/>
+        <w:rPr>
+          <w:bCs/>
+          <w:iCs/>
+        </w:rPr>
+      </w:pPr>
+      <w:r>
+        <w:rPr>
+          <w:bCs/>
+          <w:iCs/>
+        </w:rPr>
+        <w:t>2023 Host for three invited speakers, University of New Hampshire</w:t>
+      </w:r>
+    </w:p>
+    <w:p>
+      <w:pPr>
+        <w:ind w:left="360" w:right="90" w:hanging="360"/>
+        <w:rPr>
+          <w:rFonts w:ascii="TimesNewRomanPSMT" w:hAnsi="TimesNewRomanPSMT"/>
+        </w:rPr>
+      </w:pPr>
+      <w:r>
+        <w:rPr>
+          <w:rFonts w:ascii="TimesNewRomanPSMT" w:hAnsi="TimesNewRomanPSMT"/>
+        </w:rPr>
+        <w:t>2022, 2021 Invited Judge College of Life Science and Agriculture Undergraduate Research Conference, University of New Hampshire</w:t>
+      </w:r>
+    </w:p>
+    <w:p>
+      <w:pPr>
+        <w:ind w:left="360" w:right="90" w:hanging="360"/>
+        <w:rPr>
+          <w:rFonts w:ascii="TimesNewRomanPSMT" w:hAnsi="TimesNewRomanPSMT"/>
+        </w:rPr>
+      </w:pPr>
+      <w:r>
+        <w:rPr>
+          <w:rFonts w:ascii="TimesNewRomanPSMT" w:hAnsi="TimesNewRomanPSMT"/>
+        </w:rPr>
+        <w:t xml:space="preserve">2022 Session Chair, </w:t>
+      </w:r>
+      <w:r>
+        <w:t xml:space="preserve">The Society for Integrative &amp; Comparative Biology Annual Meeting. </w:t>
+      </w:r>
+      <w:r>
+        <w:rPr>
+          <w:bCs/>
+          <w:iCs/>
+        </w:rPr>
+        <w:t>Phoenix, Arizona</w:t>
+      </w:r>
+    </w:p>
+    <w:p>
+      <w:pPr>
+        <w:ind w:left="360" w:right="90" w:hanging="360"/>
+      </w:pPr>
+      <w:r>
+        <w:t xml:space="preserve">2022, 2021 Grad student social coordinator in the Department of Molecular, Cellular, Biomedical Sciences, University of New Hampshire </w:t>
+      </w:r>
+    </w:p>
+    <w:p>
+      <w:pPr>
+        <w:ind w:left="360" w:right="90" w:hanging="360"/>
+      </w:pPr>
+      <w:r>
+        <w:t>2021 Three Minute Thesis, University of New Hampshire</w:t>
+      </w:r>
+    </w:p>
+    <w:p>
+      <w:pPr>
+        <w:ind w:left="360" w:right="90" w:hanging="360"/>
+        <w:rPr>
+          <w:rFonts w:ascii="TimesNewRomanPSMT" w:hAnsi="TimesNewRomanPSMT"/>
+        </w:rPr>
+      </w:pPr>
+      <w:r>
+        <w:rPr>
+          <w:rFonts w:ascii="TimesNewRomanPSMT" w:hAnsi="TimesNewRomanPSMT"/>
+        </w:rPr>
+        <w:t xml:space="preserve">2019 Skype a Scientist (middle school). Three classes: Actual Living Scientist. </w:t>
+      </w:r>
+    </w:p>
+    <w:p>
+      <w:pPr>
+        <w:ind w:left="360" w:right="90" w:hanging="360"/>
+        <w:rPr>
+          <w:rFonts w:ascii="TimesNewRomanPSMT" w:hAnsi="TimesNewRomanPSMT"/>
+        </w:rPr>
+      </w:pPr>
+      <w:r>
+        <w:rPr>
+          <w:rFonts w:ascii="TimesNewRomanPSMT" w:hAnsi="TimesNewRomanPSMT"/>
+        </w:rPr>
+        <w:t xml:space="preserve">2019 Presenter, Science Sleuths (Preschool). Two class periods: What are fish? University of New Hampshire </w:t>
+      </w:r>
+    </w:p>
+    <w:p>
+      <w:pPr>
+        <w:ind w:left="360" w:right="90" w:hanging="360"/>
+        <w:rPr>
+          <w:rFonts w:ascii="TimesNewRomanPSMT" w:hAnsi="TimesNewRomanPSMT"/>
+        </w:rPr>
+      </w:pPr>
+      <w:r>
+        <w:rPr>
+          <w:rFonts w:ascii="TimesNewRomanPSMT" w:hAnsi="TimesNewRomanPSMT"/>
+        </w:rPr>
+        <w:t>2019 Invited Judge Jim and Katie Krause College of Natural Resources Student Research Symposium, University of Wisconsin – Stevens Point</w:t>
+      </w:r>
+    </w:p>
+    <w:p>
+      <w:pPr>
+        <w:ind w:left="360" w:right="90" w:hanging="360"/>
+        <w:rPr>
+          <w:rFonts w:ascii="TimesNewRoman" w:hAnsi="TimesNewRoman"/>
+        </w:rPr>
+      </w:pPr>
+      <w:r>
+        <w:rPr>
+          <w:rFonts w:ascii="TimesNewRoman" w:hAnsi="TimesNewRoman"/>
+        </w:rPr>
+        <w:t>2019 Presenter, STE</w:t>
+      </w:r>
+      <w:r>
+        <w:rPr>
+          <w:rFonts w:ascii="TimesNewRomanPSMT" w:hAnsi="TimesNewRomanPSMT"/>
+        </w:rPr>
+        <w:t>A</w:t>
+      </w:r>
+      <w:r>
+        <w:rPr>
+          <w:rFonts w:ascii="TimesNewRoman" w:hAnsi="TimesNewRoman"/>
+        </w:rPr>
+        <w:t xml:space="preserve">M </w:t>
+      </w:r>
+      <w:r>
+        <w:rPr>
+          <w:rFonts w:ascii="TimesNewRomanPSMT" w:hAnsi="TimesNewRomanPSMT"/>
+        </w:rPr>
+        <w:t xml:space="preserve">Point Day for Girls </w:t>
+      </w:r>
+      <w:r>
+        <w:rPr>
+          <w:rFonts w:ascii="TimesNewRoman" w:hAnsi="TimesNewRoman"/>
+        </w:rPr>
+        <w:t xml:space="preserve">(16 middle school students per class). </w:t>
+      </w:r>
+      <w:r>
+        <w:rPr>
+          <w:rFonts w:ascii="TimesNewRomanPSMT" w:hAnsi="TimesNewRomanPSMT"/>
+        </w:rPr>
+        <w:t xml:space="preserve">Two </w:t>
+      </w:r>
+      <w:r>
+        <w:rPr>
+          <w:rFonts w:ascii="TimesNewRoman" w:hAnsi="TimesNewRoman"/>
+        </w:rPr>
+        <w:t>class periods:</w:t>
+      </w:r>
+      <w:r>
+        <w:rPr>
+          <w:rFonts w:ascii="TimesNewRoman" w:hAnsi="TimesNewRoman"/>
+        </w:rPr>
+        <w:t xml:space="preserve"> </w:t>
+      </w:r>
+      <w:r>
+        <w:rPr>
+          <w:rFonts w:ascii="TimesNewRoman" w:hAnsi="TimesNewRoman"/>
+        </w:rPr>
+        <w:t xml:space="preserve">Evolution Board Game. University of Wisconsin – Stevens Point </w:t>
+      </w:r>
+    </w:p>
+    <w:p>
+      <w:pPr>
+        <w:ind w:left="360" w:right="90" w:hanging="360"/>
+        <w:rPr>
+          <w:rFonts w:ascii="TimesNewRomanPSMT" w:hAnsi="TimesNewRomanPSMT"/>
+        </w:rPr>
+      </w:pPr>
+      <w:r>
+        <w:rPr>
+          <w:rFonts w:ascii="TimesNewRomanPSMT" w:hAnsi="TimesNewRomanPSMT"/>
+        </w:rPr>
+        <w:t>2018 Invited Judge Jim and Katie Krause College of Natural Resources Student Research Symposium, University of Wisconsin – Stevens Poin</w:t>
+      </w:r>
+      <w:r>
+        <w:rPr>
+          <w:rFonts w:ascii="TimesNewRomanPSMT" w:hAnsi="TimesNewRomanPSMT"/>
+        </w:rPr>
+        <w:t>t</w:t>
+      </w:r>
+    </w:p>
+    <w:p>
+      <w:pPr>
+        <w:ind w:left="360" w:right="90" w:hanging="360"/>
+        <w:rPr>
+          <w:rFonts w:ascii="TimesNewRomanPSMT" w:hAnsi="TimesNewRomanPSMT"/>
+        </w:rPr>
+      </w:pPr>
+      <w:r>
+        <w:rPr>
+          <w:rFonts w:ascii="TimesNewRoman" w:hAnsi="TimesNewRoman"/>
+        </w:rPr>
+        <w:t>2018 Presenter, STE</w:t>
+      </w:r>
+      <w:r>
+        <w:rPr>
+          <w:rFonts w:ascii="TimesNewRomanPSMT" w:hAnsi="TimesNewRomanPSMT"/>
+        </w:rPr>
+        <w:t>A</w:t>
+      </w:r>
+      <w:r>
+        <w:rPr>
+          <w:rFonts w:ascii="TimesNewRoman" w:hAnsi="TimesNewRoman"/>
+        </w:rPr>
+        <w:t xml:space="preserve">M </w:t>
+      </w:r>
+      <w:r>
+        <w:rPr>
+          <w:rFonts w:ascii="TimesNewRomanPSMT" w:hAnsi="TimesNewRomanPSMT"/>
+        </w:rPr>
+        <w:t xml:space="preserve">Point Day for Boys </w:t>
+      </w:r>
+      <w:r>
+        <w:rPr>
+          <w:rFonts w:ascii="TimesNewRoman" w:hAnsi="TimesNewRoman"/>
+        </w:rPr>
+        <w:t xml:space="preserve">(16 middle school students per class). </w:t>
+      </w:r>
+      <w:r>
+        <w:rPr>
+          <w:rFonts w:ascii="TimesNewRomanPSMT" w:hAnsi="TimesNewRomanPSMT"/>
+        </w:rPr>
+        <w:t xml:space="preserve">Two </w:t>
+      </w:r>
+      <w:r>
+        <w:rPr>
+          <w:rFonts w:ascii="TimesNewRoman" w:hAnsi="TimesNewRoman"/>
+        </w:rPr>
+        <w:t xml:space="preserve">class periods: Evolution Board Game. University of Wisconsin – Stevens Point </w:t>
+      </w:r>
+    </w:p>
+    <w:p>
+      <w:pPr>
+        <w:ind w:left="360" w:right="90" w:hanging="360"/>
+        <w:rPr>
+          <w:rFonts w:ascii="TimesNewRomanPSMT" w:hAnsi="TimesNewRomanPSMT"/>
+        </w:rPr>
+      </w:pPr>
+      <w:r>
+        <w:rPr>
+          <w:rFonts w:ascii="TimesNewRomanPSMT" w:hAnsi="TimesNewRomanPSMT"/>
+        </w:rPr>
+        <w:t xml:space="preserve">2018 Presenter, STEM Exploration Day at </w:t>
+      </w:r>
+      <w:proofErr w:type="spellStart"/>
+      <w:r>
+        <w:rPr>
+          <w:rFonts w:ascii="TimesNewRomanPSMT" w:hAnsi="TimesNewRomanPSMT"/>
+        </w:rPr>
+        <w:t>Treehaven</w:t>
+      </w:r>
+      <w:proofErr w:type="spellEnd"/>
+      <w:r>
+        <w:rPr>
+          <w:rFonts w:ascii="TimesNewRomanPSMT" w:hAnsi="TimesNewRomanPSMT"/>
+        </w:rPr>
+        <w:t xml:space="preserve"> (16 middle school students per class). Three class periods: Evolution Board Game. University of Wisconsin – Stevens Point </w:t>
+      </w:r>
     </w:p>
     <w:p>
       <w:pPr>
@@ -2379,399 +2738,30 @@
           <w:bCs/>
         </w:rPr>
       </w:pPr>
-      <w:r>
+    </w:p>
+    <w:p>
+      <w:pPr>
+        <w:spacing w:line="259" w:lineRule="auto"/>
+        <w:ind w:left="270" w:right="90" w:hanging="270"/>
         <w:rPr>
           <w:b/>
           <w:bCs/>
         </w:rPr>
-        <w:t>PROFESSIONAL SERVICE</w:t>
-      </w:r>
-    </w:p>
-    <w:p>
-      <w:pPr>
-        <w:ind w:left="360" w:right="90" w:hanging="360"/>
-        <w:rPr>
-          <w:rFonts w:ascii="TimesNewRomanPSMT" w:hAnsi="TimesNewRomanPSMT"/>
-        </w:rPr>
-      </w:pPr>
-      <w:r>
-        <w:rPr>
-          <w:rFonts w:ascii="TimesNewRomanPSMT" w:hAnsi="TimesNewRomanPSMT"/>
-        </w:rPr>
-        <w:t xml:space="preserve">Ad hoc reviewer: </w:t>
-      </w:r>
-      <w:r>
-        <w:rPr>
-          <w:rFonts w:ascii="TimesNewRomanPSMT" w:hAnsi="TimesNewRomanPSMT"/>
-        </w:rPr>
-        <w:t xml:space="preserve">Ecological and Evolutionary Physiology (1), </w:t>
-      </w:r>
-      <w:r>
-        <w:rPr>
-          <w:rFonts w:ascii="TimesNewRomanPSMT" w:hAnsi="TimesNewRomanPSMT"/>
-        </w:rPr>
-        <w:t>Molecular Ecology (2), Transactions of the American Fisheries Society (1)</w:t>
-      </w:r>
-    </w:p>
-    <w:p>
-      <w:pPr>
-        <w:ind w:left="360" w:right="90" w:hanging="360"/>
-        <w:rPr>
-          <w:bCs/>
-          <w:iCs/>
-        </w:rPr>
-      </w:pPr>
-      <w:r>
-        <w:rPr>
-          <w:bCs/>
-          <w:iCs/>
-        </w:rPr>
-        <w:t>2023-2024 Elected COLSA Senator, Grad Student Senate, University of New Hampshire</w:t>
-      </w:r>
-    </w:p>
-    <w:p>
-      <w:pPr>
-        <w:ind w:left="360" w:right="90" w:hanging="360"/>
-        <w:rPr>
-          <w:rFonts w:ascii="TimesNewRomanPSMT" w:hAnsi="TimesNewRomanPSMT"/>
-        </w:rPr>
-      </w:pPr>
-      <w:r>
-        <w:rPr>
-          <w:bCs/>
-          <w:iCs/>
-        </w:rPr>
-        <w:t>2023 Invited Presenter, Seacoast Sips of Science, University of New Hampshire</w:t>
-      </w:r>
-    </w:p>
-    <w:p>
-      <w:pPr>
-        <w:ind w:left="360" w:right="90" w:hanging="360"/>
-        <w:rPr>
-          <w:bCs/>
-          <w:iCs/>
-        </w:rPr>
-      </w:pPr>
-      <w:r>
-        <w:rPr>
-          <w:rFonts w:ascii="TimesNewRomanPSMT" w:hAnsi="TimesNewRomanPSMT"/>
-        </w:rPr>
-        <w:t xml:space="preserve">2023 Session Chair, </w:t>
-      </w:r>
-      <w:r>
-        <w:rPr>
-          <w:bCs/>
-          <w:iCs/>
-        </w:rPr>
-        <w:t>13th International Mammalogical Congress</w:t>
-      </w:r>
-      <w:r>
-        <w:t xml:space="preserve">. </w:t>
-      </w:r>
-      <w:r>
-        <w:rPr>
-          <w:bCs/>
-          <w:iCs/>
-        </w:rPr>
-        <w:t>Anchorage, Alaska</w:t>
-      </w:r>
-    </w:p>
-    <w:p>
-      <w:pPr>
-        <w:ind w:left="360" w:right="90" w:hanging="360"/>
-        <w:rPr>
-          <w:bCs/>
-          <w:iCs/>
-        </w:rPr>
-      </w:pPr>
-      <w:r>
-        <w:rPr>
-          <w:bCs/>
-          <w:iCs/>
-        </w:rPr>
-        <w:t>2023 Host for three invited speakers, University of New Hampshire</w:t>
-      </w:r>
-    </w:p>
-    <w:p>
-      <w:pPr>
-        <w:ind w:left="360" w:right="90" w:hanging="360"/>
-        <w:rPr>
-          <w:rFonts w:ascii="TimesNewRomanPSMT" w:hAnsi="TimesNewRomanPSMT"/>
-        </w:rPr>
-      </w:pPr>
-      <w:r>
-        <w:rPr>
-          <w:rFonts w:ascii="TimesNewRomanPSMT" w:hAnsi="TimesNewRomanPSMT"/>
-        </w:rPr>
-        <w:t>2022, 2021 Invited Judge College of Life Science and Agriculture Undergraduate Research Conference, University of New Hampshire</w:t>
-      </w:r>
-    </w:p>
-    <w:p>
-      <w:pPr>
-        <w:ind w:left="360" w:right="90" w:hanging="360"/>
-        <w:rPr>
-          <w:rFonts w:ascii="TimesNewRomanPSMT" w:hAnsi="TimesNewRomanPSMT"/>
-        </w:rPr>
-      </w:pPr>
-      <w:r>
-        <w:rPr>
-          <w:rFonts w:ascii="TimesNewRomanPSMT" w:hAnsi="TimesNewRomanPSMT"/>
-        </w:rPr>
-        <w:t xml:space="preserve">2022 Session Chair, </w:t>
-      </w:r>
-      <w:r>
-        <w:t xml:space="preserve">The Society for Integrative &amp; Comparative Biology Annual Meeting. </w:t>
-      </w:r>
-      <w:r>
-        <w:rPr>
-          <w:bCs/>
-          <w:iCs/>
-        </w:rPr>
-        <w:t>Phoenix, Arizona</w:t>
-      </w:r>
-    </w:p>
-    <w:p>
-      <w:pPr>
-        <w:ind w:left="360" w:right="90" w:hanging="360"/>
-      </w:pPr>
-      <w:r>
-        <w:t xml:space="preserve">2022, 2021 Grad student social coordinator in the Department of Molecular, Cellular, Biomedical Sciences, University of New Hampshire </w:t>
-      </w:r>
-    </w:p>
-    <w:p>
-      <w:pPr>
-        <w:ind w:left="360" w:right="90" w:hanging="360"/>
-      </w:pPr>
-      <w:r>
-        <w:t>2021 Three Minute Thesis, University of New Hampshire</w:t>
-      </w:r>
-    </w:p>
-    <w:p>
-      <w:pPr>
-        <w:ind w:left="360" w:right="90" w:hanging="360"/>
-        <w:rPr>
-          <w:rFonts w:ascii="TimesNewRomanPSMT" w:hAnsi="TimesNewRomanPSMT"/>
-        </w:rPr>
-      </w:pPr>
-      <w:r>
-        <w:rPr>
-          <w:rFonts w:ascii="TimesNewRomanPSMT" w:hAnsi="TimesNewRomanPSMT"/>
-        </w:rPr>
-        <w:t xml:space="preserve">2019 Skype a Scientist (middle school). Three classes: Actual Living Scientist. </w:t>
-      </w:r>
-    </w:p>
-    <w:p>
-      <w:pPr>
-        <w:ind w:left="360" w:right="90" w:hanging="360"/>
-        <w:rPr>
-          <w:rFonts w:ascii="TimesNewRomanPSMT" w:hAnsi="TimesNewRomanPSMT"/>
-        </w:rPr>
-      </w:pPr>
-      <w:r>
-        <w:rPr>
-          <w:rFonts w:ascii="TimesNewRomanPSMT" w:hAnsi="TimesNewRomanPSMT"/>
-        </w:rPr>
-        <w:t xml:space="preserve">2019 Presenter, Science Sleuths (Preschool). Two class periods: What are fish? University of New Hampshire </w:t>
-      </w:r>
-    </w:p>
-    <w:p>
-      <w:pPr>
-        <w:ind w:left="360" w:right="90" w:hanging="360"/>
-        <w:rPr>
-          <w:rFonts w:ascii="TimesNewRomanPSMT" w:hAnsi="TimesNewRomanPSMT"/>
-        </w:rPr>
-      </w:pPr>
-      <w:r>
-        <w:rPr>
-          <w:rFonts w:ascii="TimesNewRomanPSMT" w:hAnsi="TimesNewRomanPSMT"/>
-        </w:rPr>
-        <w:t>2019 Invited Judge Jim and Katie Krause College of Natural Resources Student Research Symposium, University of Wisconsin – Stevens Point</w:t>
-      </w:r>
-    </w:p>
-    <w:p>
-      <w:pPr>
-        <w:ind w:left="360" w:right="90" w:hanging="360"/>
-        <w:rPr>
-          <w:rFonts w:ascii="TimesNewRoman" w:hAnsi="TimesNewRoman"/>
-        </w:rPr>
-      </w:pPr>
-      <w:r>
-        <w:rPr>
-          <w:rFonts w:ascii="TimesNewRoman" w:hAnsi="TimesNewRoman"/>
-        </w:rPr>
-        <w:t>2019 Presenter, STE</w:t>
-      </w:r>
-      <w:r>
-        <w:rPr>
-          <w:rFonts w:ascii="TimesNewRomanPSMT" w:hAnsi="TimesNewRomanPSMT"/>
-        </w:rPr>
-        <w:t>A</w:t>
-      </w:r>
-      <w:r>
-        <w:rPr>
-          <w:rFonts w:ascii="TimesNewRoman" w:hAnsi="TimesNewRoman"/>
-        </w:rPr>
-        <w:t xml:space="preserve">M </w:t>
-      </w:r>
-      <w:r>
-        <w:rPr>
-          <w:rFonts w:ascii="TimesNewRomanPSMT" w:hAnsi="TimesNewRomanPSMT"/>
-        </w:rPr>
-        <w:t xml:space="preserve">Point Day for Girls </w:t>
-      </w:r>
-      <w:r>
-        <w:rPr>
-          <w:rFonts w:ascii="TimesNewRoman" w:hAnsi="TimesNewRoman"/>
-        </w:rPr>
-        <w:t xml:space="preserve">(16 middle school students per class). </w:t>
-      </w:r>
-      <w:r>
-        <w:rPr>
-          <w:rFonts w:ascii="TimesNewRomanPSMT" w:hAnsi="TimesNewRomanPSMT"/>
-        </w:rPr>
-        <w:t xml:space="preserve">Two </w:t>
-      </w:r>
-      <w:r>
-        <w:rPr>
-          <w:rFonts w:ascii="TimesNewRoman" w:hAnsi="TimesNewRoman"/>
-        </w:rPr>
-        <w:t>class periods:</w:t>
-      </w:r>
-      <w:r>
-        <w:rPr>
-          <w:rFonts w:ascii="TimesNewRoman" w:hAnsi="TimesNewRoman"/>
-        </w:rPr>
-        <w:t xml:space="preserve"> </w:t>
-      </w:r>
-      <w:r>
-        <w:rPr>
-          <w:rFonts w:ascii="TimesNewRoman" w:hAnsi="TimesNewRoman"/>
-        </w:rPr>
-        <w:t xml:space="preserve">Evolution Board Game. University of Wisconsin – Stevens Point </w:t>
-      </w:r>
-    </w:p>
-    <w:p>
-      <w:pPr>
-        <w:ind w:left="360" w:right="90" w:hanging="360"/>
-        <w:rPr>
-          <w:rFonts w:ascii="TimesNewRomanPSMT" w:hAnsi="TimesNewRomanPSMT"/>
-        </w:rPr>
-      </w:pPr>
-      <w:r>
-        <w:rPr>
-          <w:rFonts w:ascii="TimesNewRomanPSMT" w:hAnsi="TimesNewRomanPSMT"/>
-        </w:rPr>
-        <w:t>2018 Invited Judge Jim and Katie Krause College of Natural Resources Student Research Symposium, University of Wisconsin – Stevens Poin</w:t>
-      </w:r>
-      <w:r>
-        <w:rPr>
-          <w:rFonts w:ascii="TimesNewRomanPSMT" w:hAnsi="TimesNewRomanPSMT"/>
-        </w:rPr>
-        <w:t>t</w:t>
-      </w:r>
-    </w:p>
-    <w:p>
-      <w:pPr>
-        <w:ind w:left="360" w:right="90" w:hanging="360"/>
-        <w:rPr>
-          <w:rFonts w:ascii="TimesNewRomanPSMT" w:hAnsi="TimesNewRomanPSMT"/>
-        </w:rPr>
-      </w:pPr>
-      <w:r>
-        <w:rPr>
-          <w:rFonts w:ascii="TimesNewRoman" w:hAnsi="TimesNewRoman"/>
-        </w:rPr>
-        <w:t>2018 Presenter, STE</w:t>
-      </w:r>
-      <w:r>
-        <w:rPr>
-          <w:rFonts w:ascii="TimesNewRomanPSMT" w:hAnsi="TimesNewRomanPSMT"/>
-        </w:rPr>
-        <w:t>A</w:t>
-      </w:r>
-      <w:r>
-        <w:rPr>
-          <w:rFonts w:ascii="TimesNewRoman" w:hAnsi="TimesNewRoman"/>
-        </w:rPr>
-        <w:t xml:space="preserve">M </w:t>
-      </w:r>
-      <w:r>
-        <w:rPr>
-          <w:rFonts w:ascii="TimesNewRomanPSMT" w:hAnsi="TimesNewRomanPSMT"/>
-        </w:rPr>
-        <w:t xml:space="preserve">Point Day for Boys </w:t>
-      </w:r>
-      <w:r>
-        <w:rPr>
-          <w:rFonts w:ascii="TimesNewRoman" w:hAnsi="TimesNewRoman"/>
-        </w:rPr>
-        <w:t xml:space="preserve">(16 middle school students per class). </w:t>
-      </w:r>
-      <w:r>
-        <w:rPr>
-          <w:rFonts w:ascii="TimesNewRomanPSMT" w:hAnsi="TimesNewRomanPSMT"/>
-        </w:rPr>
-        <w:t xml:space="preserve">Two </w:t>
-      </w:r>
-      <w:r>
-        <w:rPr>
-          <w:rFonts w:ascii="TimesNewRoman" w:hAnsi="TimesNewRoman"/>
-        </w:rPr>
-        <w:t xml:space="preserve">class periods: Evolution Board Game. University of Wisconsin – Stevens Point </w:t>
-      </w:r>
-    </w:p>
-    <w:p>
-      <w:pPr>
-        <w:ind w:left="360" w:right="90" w:hanging="360"/>
-        <w:rPr>
-          <w:rFonts w:ascii="TimesNewRomanPSMT" w:hAnsi="TimesNewRomanPSMT"/>
-        </w:rPr>
-      </w:pPr>
-      <w:r>
-        <w:rPr>
-          <w:rFonts w:ascii="TimesNewRomanPSMT" w:hAnsi="TimesNewRomanPSMT"/>
-        </w:rPr>
-        <w:t xml:space="preserve">2018 Presenter, STEM Exploration Day at </w:t>
-      </w:r>
-      <w:proofErr w:type="spellStart"/>
-      <w:r>
-        <w:rPr>
-          <w:rFonts w:ascii="TimesNewRomanPSMT" w:hAnsi="TimesNewRomanPSMT"/>
-        </w:rPr>
-        <w:t>Treehaven</w:t>
-      </w:r>
-      <w:proofErr w:type="spellEnd"/>
-      <w:r>
-        <w:rPr>
-          <w:rFonts w:ascii="TimesNewRomanPSMT" w:hAnsi="TimesNewRomanPSMT"/>
-        </w:rPr>
-        <w:t xml:space="preserve"> (16 middle school students per class). Three class periods: Evolution Board Game. University of Wisconsin – Stevens Point </w:t>
-      </w:r>
-    </w:p>
-    <w:p>
-      <w:pPr>
-        <w:ind w:left="270" w:right="90" w:hanging="270"/>
+      </w:pPr>
+      <w:r>
         <w:rPr>
           <w:b/>
           <w:bCs/>
         </w:rPr>
-      </w:pPr>
-    </w:p>
-    <w:p>
-      <w:pPr>
-        <w:spacing w:line="259" w:lineRule="auto"/>
+        <w:t>PRESS</w:t>
+      </w:r>
+    </w:p>
+    <w:p>
+      <w:pPr>
         <w:ind w:left="270" w:right="90" w:hanging="270"/>
-        <w:rPr>
-          <w:b/>
-          <w:bCs/>
-        </w:rPr>
-      </w:pPr>
-      <w:r>
-        <w:rPr>
-          <w:b/>
-          <w:bCs/>
-        </w:rPr>
-        <w:t>PRESS</w:t>
+      </w:pPr>
+      <w:r>
+        <w:t>Neon Blog 2026: https://www.neonscience.org/impact/observatory-blog/what-can-gut-microbes-tell-us-about-animal-evolution</w:t>
       </w:r>
     </w:p>
     <w:p>

</xml_diff>